<commit_message>
docs(plan): se descarta US-11 (coleccion de Postman); Sprint 4 queda en 15 puntos
Co-Authored-By: Claude Opus 5.5 <noreply@anthropic.com>
</commit_message>
<xml_diff>
--- a/docs/planeacion-scrum-v9.docx
+++ b/docs/planeacion-scrum-v9.docx
@@ -4036,342 +4036,7 @@
           <w:sz w:val="22"/>
           <w:szCs w:val="22"/>
         </w:rPr>
-        <w:t>Sprint 4 (17 puntos)</w:t>
-      </w:r>
-    </w:p>
-    <w:p>
-      <w:pPr>
-        <w:spacing w:before="120" w:after="120"/>
-      </w:pPr>
-      <w:r>
-        <w:rPr>
-          <w:rFonts w:ascii="Arial" w:eastAsia="Arial" w:hAnsi="Arial" w:cs="Arial"/>
-          <w:b/>
-          <w:bCs/>
-          <w:sz w:val="22"/>
-          <w:szCs w:val="22"/>
-        </w:rPr>
-        <w:t>EPIC-01:</w:t>
-      </w:r>
-      <w:r>
-        <w:rPr>
-          <w:rFonts w:ascii="Arial" w:eastAsia="Arial" w:hAnsi="Arial" w:cs="Arial"/>
-          <w:sz w:val="22"/>
-          <w:szCs w:val="22"/>
-        </w:rPr>
-        <w:t xml:space="preserve"> Autenticación con JWT (cierre)</w:t>
-      </w:r>
-    </w:p>
-    <w:p>
-      <w:pPr>
-        <w:keepNext/>
-        <w:spacing w:after="120"/>
-        <w:ind w:left="360"/>
-      </w:pPr>
-      <w:r>
-        <w:rPr>
-          <w:rFonts w:ascii="Arial" w:eastAsia="Arial" w:hAnsi="Arial" w:cs="Arial"/>
-          <w:b/>
-          <w:bCs/>
-          <w:sz w:val="22"/>
-          <w:szCs w:val="22"/>
-        </w:rPr>
-        <w:t>US-11:</w:t>
-      </w:r>
-      <w:r>
-        <w:rPr>
-          <w:rFonts w:ascii="Arial" w:eastAsia="Arial" w:hAnsi="Arial" w:cs="Arial"/>
-          <w:sz w:val="22"/>
-          <w:szCs w:val="22"/>
-        </w:rPr>
-        <w:t xml:space="preserve"> Colección de </w:t>
-      </w:r>
-      <w:proofErr w:type="spellStart"/>
-      <w:r>
-        <w:rPr>
-          <w:rFonts w:ascii="Arial" w:eastAsia="Arial" w:hAnsi="Arial" w:cs="Arial"/>
-          <w:sz w:val="22"/>
-          <w:szCs w:val="22"/>
-        </w:rPr>
-        <w:t>Postman</w:t>
-      </w:r>
-      <w:proofErr w:type="spellEnd"/>
-      <w:r>
-        <w:rPr>
-          <w:rFonts w:ascii="Arial" w:eastAsia="Arial" w:hAnsi="Arial" w:cs="Arial"/>
-          <w:sz w:val="22"/>
-          <w:szCs w:val="22"/>
-        </w:rPr>
-        <w:t xml:space="preserve"> para demostrar la API JWT – 2 Puntos (Como equipo queremos una colección de </w:t>
-      </w:r>
-      <w:proofErr w:type="spellStart"/>
-      <w:r>
-        <w:rPr>
-          <w:rFonts w:ascii="Arial" w:eastAsia="Arial" w:hAnsi="Arial" w:cs="Arial"/>
-          <w:sz w:val="22"/>
-          <w:szCs w:val="22"/>
-        </w:rPr>
-        <w:t>Postman</w:t>
-      </w:r>
-      <w:proofErr w:type="spellEnd"/>
-      <w:r>
-        <w:rPr>
-          <w:rFonts w:ascii="Arial" w:eastAsia="Arial" w:hAnsi="Arial" w:cs="Arial"/>
-          <w:sz w:val="22"/>
-          <w:szCs w:val="22"/>
-        </w:rPr>
-        <w:t xml:space="preserve"> que ejercite el </w:t>
-      </w:r>
-      <w:proofErr w:type="spellStart"/>
-      <w:r>
-        <w:rPr>
-          <w:rFonts w:ascii="Arial" w:eastAsia="Arial" w:hAnsi="Arial" w:cs="Arial"/>
-          <w:sz w:val="22"/>
-          <w:szCs w:val="22"/>
-        </w:rPr>
-        <w:t>login</w:t>
-      </w:r>
-      <w:proofErr w:type="spellEnd"/>
-      <w:r>
-        <w:rPr>
-          <w:rFonts w:ascii="Arial" w:eastAsia="Arial" w:hAnsi="Arial" w:cs="Arial"/>
-          <w:sz w:val="22"/>
-          <w:szCs w:val="22"/>
-        </w:rPr>
-        <w:t xml:space="preserve"> y el registro por JWT ya construidos en el Sprint 1, para demostrar en la sustentación que</w:t>
-      </w:r>
-      <w:r>
-        <w:rPr>
-          <w:rFonts w:ascii="Arial" w:eastAsia="Arial" w:hAnsi="Arial" w:cs="Arial"/>
-          <w:sz w:val="22"/>
-          <w:szCs w:val="22"/>
-        </w:rPr>
-        <w:t xml:space="preserve"> la capa /api/** funciona sin necesidad de construirle nuevos </w:t>
-      </w:r>
-      <w:proofErr w:type="spellStart"/>
-      <w:r>
-        <w:rPr>
-          <w:rFonts w:ascii="Arial" w:eastAsia="Arial" w:hAnsi="Arial" w:cs="Arial"/>
-          <w:sz w:val="22"/>
-          <w:szCs w:val="22"/>
-        </w:rPr>
-        <w:t>endpoints</w:t>
-      </w:r>
-      <w:proofErr w:type="spellEnd"/>
-      <w:r>
-        <w:rPr>
-          <w:rFonts w:ascii="Arial" w:eastAsia="Arial" w:hAnsi="Arial" w:cs="Arial"/>
-          <w:sz w:val="22"/>
-          <w:szCs w:val="22"/>
-        </w:rPr>
-        <w:t>)</w:t>
-      </w:r>
-    </w:p>
-    <w:p>
-      <w:pPr>
-        <w:keepNext/>
-        <w:spacing w:after="120"/>
-        <w:ind w:left="720"/>
-      </w:pPr>
-      <w:r>
-        <w:rPr>
-          <w:rFonts w:ascii="Arial" w:eastAsia="Arial" w:hAnsi="Arial" w:cs="Arial"/>
-          <w:b/>
-          <w:bCs/>
-          <w:sz w:val="22"/>
-          <w:szCs w:val="22"/>
-        </w:rPr>
-        <w:t>Criterios de Aceptación:</w:t>
-      </w:r>
-    </w:p>
-    <w:p>
-      <w:pPr>
-        <w:spacing w:after="120"/>
-        <w:ind w:left="720"/>
-      </w:pPr>
-      <w:r>
-        <w:rPr>
-          <w:rFonts w:ascii="Arial" w:eastAsia="Arial" w:hAnsi="Arial" w:cs="Arial"/>
-          <w:b/>
-          <w:bCs/>
-          <w:sz w:val="22"/>
-          <w:szCs w:val="22"/>
-        </w:rPr>
-        <w:t>AC1:</w:t>
-      </w:r>
-      <w:r>
-        <w:rPr>
-          <w:rFonts w:ascii="Arial" w:eastAsia="Arial" w:hAnsi="Arial" w:cs="Arial"/>
-          <w:sz w:val="22"/>
-          <w:szCs w:val="22"/>
-        </w:rPr>
-        <w:t xml:space="preserve"> Debe existir una colección de </w:t>
-      </w:r>
-      <w:proofErr w:type="spellStart"/>
-      <w:r>
-        <w:rPr>
-          <w:rFonts w:ascii="Arial" w:eastAsia="Arial" w:hAnsi="Arial" w:cs="Arial"/>
-          <w:sz w:val="22"/>
-          <w:szCs w:val="22"/>
-        </w:rPr>
-        <w:t>Postman</w:t>
-      </w:r>
-      <w:proofErr w:type="spellEnd"/>
-      <w:r>
-        <w:rPr>
-          <w:rFonts w:ascii="Arial" w:eastAsia="Arial" w:hAnsi="Arial" w:cs="Arial"/>
-          <w:sz w:val="22"/>
-          <w:szCs w:val="22"/>
-        </w:rPr>
-        <w:t>, versionada en el repositorio, que demuestre POST /api/</w:t>
-      </w:r>
-      <w:proofErr w:type="spellStart"/>
-      <w:r>
-        <w:rPr>
-          <w:rFonts w:ascii="Arial" w:eastAsia="Arial" w:hAnsi="Arial" w:cs="Arial"/>
-          <w:sz w:val="22"/>
-          <w:szCs w:val="22"/>
-        </w:rPr>
-        <w:t>auth</w:t>
-      </w:r>
-      <w:proofErr w:type="spellEnd"/>
-      <w:r>
-        <w:rPr>
-          <w:rFonts w:ascii="Arial" w:eastAsia="Arial" w:hAnsi="Arial" w:cs="Arial"/>
-          <w:sz w:val="22"/>
-          <w:szCs w:val="22"/>
-        </w:rPr>
-        <w:t>/</w:t>
-      </w:r>
-      <w:proofErr w:type="spellStart"/>
-      <w:r>
-        <w:rPr>
-          <w:rFonts w:ascii="Arial" w:eastAsia="Arial" w:hAnsi="Arial" w:cs="Arial"/>
-          <w:sz w:val="22"/>
-          <w:szCs w:val="22"/>
-        </w:rPr>
-        <w:t>login</w:t>
-      </w:r>
-      <w:proofErr w:type="spellEnd"/>
-      <w:r>
-        <w:rPr>
-          <w:rFonts w:ascii="Arial" w:eastAsia="Arial" w:hAnsi="Arial" w:cs="Arial"/>
-          <w:sz w:val="22"/>
-          <w:szCs w:val="22"/>
-        </w:rPr>
-        <w:t xml:space="preserve"> y POST /api/</w:t>
-      </w:r>
-      <w:proofErr w:type="spellStart"/>
-      <w:r>
-        <w:rPr>
-          <w:rFonts w:ascii="Arial" w:eastAsia="Arial" w:hAnsi="Arial" w:cs="Arial"/>
-          <w:sz w:val="22"/>
-          <w:szCs w:val="22"/>
-        </w:rPr>
-        <w:t>auth</w:t>
-      </w:r>
-      <w:proofErr w:type="spellEnd"/>
-      <w:r>
-        <w:rPr>
-          <w:rFonts w:ascii="Arial" w:eastAsia="Arial" w:hAnsi="Arial" w:cs="Arial"/>
-          <w:sz w:val="22"/>
-          <w:szCs w:val="22"/>
-        </w:rPr>
-        <w:t>/registro, con la URL base y el t</w:t>
-      </w:r>
-      <w:r>
-        <w:rPr>
-          <w:rFonts w:ascii="Arial" w:eastAsia="Arial" w:hAnsi="Arial" w:cs="Arial"/>
-          <w:sz w:val="22"/>
-          <w:szCs w:val="22"/>
-        </w:rPr>
-        <w:t>oken como variables para correrla igual en local y en Render.</w:t>
-      </w:r>
-    </w:p>
-    <w:p>
-      <w:pPr>
-        <w:spacing w:after="120"/>
-        <w:ind w:left="720"/>
-      </w:pPr>
-      <w:r>
-        <w:rPr>
-          <w:rFonts w:ascii="Arial" w:eastAsia="Arial" w:hAnsi="Arial" w:cs="Arial"/>
-          <w:b/>
-          <w:bCs/>
-          <w:sz w:val="22"/>
-          <w:szCs w:val="22"/>
-        </w:rPr>
-        <w:lastRenderedPageBreak/>
-        <w:t>AC2:</w:t>
-      </w:r>
-      <w:r>
-        <w:rPr>
-          <w:rFonts w:ascii="Arial" w:eastAsia="Arial" w:hAnsi="Arial" w:cs="Arial"/>
-          <w:sz w:val="22"/>
-          <w:szCs w:val="22"/>
-        </w:rPr>
-        <w:t xml:space="preserve"> La colección debe incluir una petición a /api/** sin token que reciba 401, para mostrar que el filtro JWT rechaza peticiones no autenticadas.</w:t>
-      </w:r>
-    </w:p>
-    <w:p>
-      <w:pPr>
-        <w:keepNext/>
-        <w:spacing w:after="120"/>
-        <w:ind w:left="720"/>
-      </w:pPr>
-      <w:r>
-        <w:rPr>
-          <w:rFonts w:ascii="Arial" w:eastAsia="Arial" w:hAnsi="Arial" w:cs="Arial"/>
-          <w:b/>
-          <w:bCs/>
-          <w:sz w:val="22"/>
-          <w:szCs w:val="22"/>
-        </w:rPr>
-        <w:t>Tareas:</w:t>
-      </w:r>
-    </w:p>
-    <w:p>
-      <w:pPr>
-        <w:pStyle w:val="Prrafodelista"/>
-        <w:numPr>
-          <w:ilvl w:val="1"/>
-          <w:numId w:val="2"/>
-        </w:numPr>
-        <w:spacing w:after="100"/>
-      </w:pPr>
-      <w:r>
-        <w:rPr>
-          <w:rFonts w:ascii="Arial" w:eastAsia="Arial" w:hAnsi="Arial" w:cs="Arial"/>
-          <w:sz w:val="22"/>
-          <w:szCs w:val="22"/>
-        </w:rPr>
-        <w:t xml:space="preserve">TASK-28: Colección de </w:t>
-      </w:r>
-      <w:proofErr w:type="spellStart"/>
-      <w:r>
-        <w:rPr>
-          <w:rFonts w:ascii="Arial" w:eastAsia="Arial" w:hAnsi="Arial" w:cs="Arial"/>
-          <w:sz w:val="22"/>
-          <w:szCs w:val="22"/>
-        </w:rPr>
-        <w:t>Postman</w:t>
-      </w:r>
-      <w:proofErr w:type="spellEnd"/>
-      <w:r>
-        <w:rPr>
-          <w:rFonts w:ascii="Arial" w:eastAsia="Arial" w:hAnsi="Arial" w:cs="Arial"/>
-          <w:sz w:val="22"/>
-          <w:szCs w:val="22"/>
-        </w:rPr>
-        <w:t xml:space="preserve"> con ejemp</w:t>
-      </w:r>
-      <w:r>
-        <w:rPr>
-          <w:rFonts w:ascii="Arial" w:eastAsia="Arial" w:hAnsi="Arial" w:cs="Arial"/>
-          <w:sz w:val="22"/>
-          <w:szCs w:val="22"/>
-        </w:rPr>
-        <w:t>los y variables para la demostración (30-31 oct)</w:t>
+        <w:t>Sprint 4 (15 puntos)</w:t>
       </w:r>
     </w:p>
     <w:p>

</xml_diff>

<commit_message>
docs(plan): la planeacion refleja lo que usa la app web, sin la API
Sprint 1 cuenta lo que de verdad se hizo: JWT en cookie HttpOnly para la
app web (US-01) e integracion del equipo con pruebas aisladas (US-02).
US-07, US-13 y el mapa sin criterios de API; US-14 al dia (certificado
retirado, documentacion con perfil y mapa); Sprint 4 sin hueco al inicio.
Numeracion consecutiva: el mapa pasa a US-11 (TASK-28 a 30) y el Sprint 4
usa TASK-31 a 38. El backlog (React a futuro) no cambia.

Co-Authored-By: Claude Opus 5.5 <noreply@anthropic.com>
</commit_message>
<xml_diff>
--- a/docs/planeacion-scrum-v9.docx
+++ b/docs/planeacion-scrum-v9.docx
@@ -251,65 +251,21 @@
       </w:pPr>
       <w:r>
         <w:rPr>
-          <w:rFonts w:ascii="Arial" w:eastAsia="Arial" w:hAnsi="Arial" w:cs="Arial"/>
-          <w:b/>
-          <w:bCs/>
-          <w:sz w:val="22"/>
-          <w:szCs w:val="22"/>
-        </w:rPr>
-        <w:t>US-01:</w:t>
-      </w:r>
-      <w:r>
-        <w:rPr>
-          <w:rFonts w:ascii="Arial" w:eastAsia="Arial" w:hAnsi="Arial" w:cs="Arial"/>
-          <w:sz w:val="22"/>
-          <w:szCs w:val="22"/>
-        </w:rPr>
-        <w:t xml:space="preserve"> </w:t>
-      </w:r>
-      <w:proofErr w:type="spellStart"/>
-      <w:r>
-        <w:rPr>
-          <w:rFonts w:ascii="Arial" w:eastAsia="Arial" w:hAnsi="Arial" w:cs="Arial"/>
-          <w:sz w:val="22"/>
-          <w:szCs w:val="22"/>
-        </w:rPr>
-        <w:t>Login</w:t>
-      </w:r>
-      <w:proofErr w:type="spellEnd"/>
-      <w:r>
-        <w:rPr>
-          <w:rFonts w:ascii="Arial" w:eastAsia="Arial" w:hAnsi="Arial" w:cs="Arial"/>
-          <w:sz w:val="22"/>
-          <w:szCs w:val="22"/>
-        </w:rPr>
-        <w:t xml:space="preserve"> vía API con JWT – 8 Puntos (Como usuario (cliente, administrador o superadministrador) quiero autenticarme mediante un </w:t>
-      </w:r>
-      <w:proofErr w:type="spellStart"/>
-      <w:r>
-        <w:rPr>
-          <w:rFonts w:ascii="Arial" w:eastAsia="Arial" w:hAnsi="Arial" w:cs="Arial"/>
-          <w:sz w:val="22"/>
-          <w:szCs w:val="22"/>
-        </w:rPr>
-        <w:t>endpoint</w:t>
-      </w:r>
-      <w:proofErr w:type="spellEnd"/>
-      <w:r>
-        <w:rPr>
-          <w:rFonts w:ascii="Arial" w:eastAsia="Arial" w:hAnsi="Arial" w:cs="Arial"/>
-          <w:sz w:val="22"/>
-          <w:szCs w:val="22"/>
-        </w:rPr>
-        <w:t xml:space="preserve"> REST que me entregue un token JWT, para acceder a los recursos protegidos de la API </w:t>
-      </w:r>
-      <w:r>
-        <w:rPr>
-          <w:rFonts w:ascii="Arial" w:eastAsia="Arial" w:hAnsi="Arial" w:cs="Arial"/>
-          <w:sz w:val="22"/>
-          <w:szCs w:val="22"/>
-        </w:rPr>
-        <w:t>sin depender de sesión de servidor)</w:t>
+          <w:rFonts w:ascii="Arial" w:cs="Arial" w:eastAsia="Arial" w:hAnsi="Arial"/>
+          <w:b/>
+          <w:bCs/>
+          <w:sz w:val="22"/>
+          <w:szCs w:val="22"/>
+        </w:rPr>
+        <w:t xml:space="preserve">US-01:</w:t>
+      </w:r>
+      <w:r>
+        <w:rPr>
+          <w:rFonts w:ascii="Arial" w:cs="Arial" w:eastAsia="Arial" w:hAnsi="Arial"/>
+          <w:sz w:val="22"/>
+          <w:szCs w:val="22"/>
+        </w:rPr>
+        <w:t xml:space="preserve"> Inicio de sesión con JWT en la aplicación web – 8 Puntos (Como usuario (cliente, administrador o superadministrador) quiero iniciar sesión y que mi sesión viaje en un token JWT, para que el servidor no tenga que guardar sesiones)</w:t>
       </w:r>
     </w:p>
     <w:p>
@@ -336,199 +292,93 @@
       </w:pPr>
       <w:r>
         <w:rPr>
-          <w:rFonts w:ascii="Arial" w:eastAsia="Arial" w:hAnsi="Arial" w:cs="Arial"/>
-          <w:b/>
-          <w:bCs/>
-          <w:sz w:val="22"/>
-          <w:szCs w:val="22"/>
-        </w:rPr>
-        <w:t>AC1:</w:t>
-      </w:r>
-      <w:r>
-        <w:rPr>
-          <w:rFonts w:ascii="Arial" w:eastAsia="Arial" w:hAnsi="Arial" w:cs="Arial"/>
-          <w:sz w:val="22"/>
-          <w:szCs w:val="22"/>
-        </w:rPr>
-        <w:t xml:space="preserve"> Dado que un usuario envía credenciales válidas a POST /api/</w:t>
-      </w:r>
-      <w:proofErr w:type="spellStart"/>
-      <w:r>
-        <w:rPr>
-          <w:rFonts w:ascii="Arial" w:eastAsia="Arial" w:hAnsi="Arial" w:cs="Arial"/>
-          <w:sz w:val="22"/>
-          <w:szCs w:val="22"/>
-        </w:rPr>
-        <w:t>auth</w:t>
-      </w:r>
-      <w:proofErr w:type="spellEnd"/>
-      <w:r>
-        <w:rPr>
-          <w:rFonts w:ascii="Arial" w:eastAsia="Arial" w:hAnsi="Arial" w:cs="Arial"/>
-          <w:sz w:val="22"/>
-          <w:szCs w:val="22"/>
-        </w:rPr>
-        <w:t>/</w:t>
-      </w:r>
-      <w:proofErr w:type="spellStart"/>
-      <w:r>
-        <w:rPr>
-          <w:rFonts w:ascii="Arial" w:eastAsia="Arial" w:hAnsi="Arial" w:cs="Arial"/>
-          <w:sz w:val="22"/>
-          <w:szCs w:val="22"/>
-        </w:rPr>
-        <w:t>login</w:t>
-      </w:r>
-      <w:proofErr w:type="spellEnd"/>
-      <w:r>
-        <w:rPr>
-          <w:rFonts w:ascii="Arial" w:eastAsia="Arial" w:hAnsi="Arial" w:cs="Arial"/>
-          <w:sz w:val="22"/>
-          <w:szCs w:val="22"/>
-        </w:rPr>
-        <w:t>, cuando el servidor las valida, entonces debe responder con un JWT firmado, con expiración corta y el rol del usuario co</w:t>
-      </w:r>
-      <w:r>
-        <w:rPr>
-          <w:rFonts w:ascii="Arial" w:eastAsia="Arial" w:hAnsi="Arial" w:cs="Arial"/>
-          <w:sz w:val="22"/>
-          <w:szCs w:val="22"/>
-        </w:rPr>
-        <w:t xml:space="preserve">mo </w:t>
-      </w:r>
-      <w:proofErr w:type="spellStart"/>
-      <w:r>
-        <w:rPr>
-          <w:rFonts w:ascii="Arial" w:eastAsia="Arial" w:hAnsi="Arial" w:cs="Arial"/>
-          <w:sz w:val="22"/>
-          <w:szCs w:val="22"/>
-        </w:rPr>
-        <w:t>claim</w:t>
-      </w:r>
-      <w:proofErr w:type="spellEnd"/>
-      <w:r>
-        <w:rPr>
-          <w:rFonts w:ascii="Arial" w:eastAsia="Arial" w:hAnsi="Arial" w:cs="Arial"/>
-          <w:sz w:val="22"/>
-          <w:szCs w:val="22"/>
-        </w:rPr>
-        <w:t>.</w:t>
-      </w:r>
-    </w:p>
-    <w:p>
-      <w:pPr>
-        <w:spacing w:after="120"/>
-        <w:ind w:left="720"/>
-      </w:pPr>
-      <w:r>
-        <w:rPr>
-          <w:rFonts w:ascii="Arial" w:eastAsia="Arial" w:hAnsi="Arial" w:cs="Arial"/>
-          <w:b/>
-          <w:bCs/>
-          <w:sz w:val="22"/>
-          <w:szCs w:val="22"/>
-        </w:rPr>
-        <w:t>AC2:</w:t>
-      </w:r>
-      <w:r>
-        <w:rPr>
-          <w:rFonts w:ascii="Arial" w:eastAsia="Arial" w:hAnsi="Arial" w:cs="Arial"/>
-          <w:sz w:val="22"/>
-          <w:szCs w:val="22"/>
-        </w:rPr>
-        <w:t xml:space="preserve"> Cuando las credenciales son inválidas, entonces el sistema debe responder 401 con un mensaje genérico, sin revelar si el correo existe.</w:t>
-      </w:r>
-    </w:p>
-    <w:p>
-      <w:pPr>
-        <w:spacing w:after="120"/>
-        <w:ind w:left="720"/>
-      </w:pPr>
-      <w:r>
-        <w:rPr>
-          <w:rFonts w:ascii="Arial" w:eastAsia="Arial" w:hAnsi="Arial" w:cs="Arial"/>
-          <w:b/>
-          <w:bCs/>
-          <w:sz w:val="22"/>
-          <w:szCs w:val="22"/>
-        </w:rPr>
-        <w:t>AC3:</w:t>
-      </w:r>
-      <w:r>
-        <w:rPr>
-          <w:rFonts w:ascii="Arial" w:eastAsia="Arial" w:hAnsi="Arial" w:cs="Arial"/>
-          <w:sz w:val="22"/>
-          <w:szCs w:val="22"/>
-        </w:rPr>
-        <w:t xml:space="preserve"> Cuando la cuenta está deshabilitada, o el administrador tiene su parqueadero deshabilitado, entonces</w:t>
-      </w:r>
-      <w:r>
-        <w:rPr>
-          <w:rFonts w:ascii="Arial" w:eastAsia="Arial" w:hAnsi="Arial" w:cs="Arial"/>
-          <w:sz w:val="22"/>
-          <w:szCs w:val="22"/>
-        </w:rPr>
-        <w:t xml:space="preserve"> el </w:t>
-      </w:r>
-      <w:proofErr w:type="spellStart"/>
-      <w:r>
-        <w:rPr>
-          <w:rFonts w:ascii="Arial" w:eastAsia="Arial" w:hAnsi="Arial" w:cs="Arial"/>
-          <w:sz w:val="22"/>
-          <w:szCs w:val="22"/>
-        </w:rPr>
-        <w:t>login</w:t>
-      </w:r>
-      <w:proofErr w:type="spellEnd"/>
-      <w:r>
-        <w:rPr>
-          <w:rFonts w:ascii="Arial" w:eastAsia="Arial" w:hAnsi="Arial" w:cs="Arial"/>
-          <w:sz w:val="22"/>
-          <w:szCs w:val="22"/>
-        </w:rPr>
-        <w:t xml:space="preserve"> debe ser rechazado, igual que en el flujo web actual (RF0023).</w:t>
-      </w:r>
-    </w:p>
-    <w:p>
-      <w:pPr>
-        <w:spacing w:after="120"/>
-        <w:ind w:left="720"/>
-      </w:pPr>
-      <w:r>
-        <w:rPr>
-          <w:rFonts w:ascii="Arial" w:eastAsia="Arial" w:hAnsi="Arial" w:cs="Arial"/>
-          <w:b/>
-          <w:bCs/>
-          <w:sz w:val="22"/>
-          <w:szCs w:val="22"/>
-        </w:rPr>
-        <w:t>AC4:</w:t>
-      </w:r>
-      <w:r>
-        <w:rPr>
-          <w:rFonts w:ascii="Arial" w:eastAsia="Arial" w:hAnsi="Arial" w:cs="Arial"/>
-          <w:sz w:val="22"/>
-          <w:szCs w:val="22"/>
-        </w:rPr>
-        <w:t xml:space="preserve"> En cada petición a /api/**, el sistema debe verificar que el usuario siga habilitado, de modo que un usuario deshabilitado pierda </w:t>
-      </w:r>
-      <w:proofErr w:type="gramStart"/>
-      <w:r>
-        <w:rPr>
-          <w:rFonts w:ascii="Arial" w:eastAsia="Arial" w:hAnsi="Arial" w:cs="Arial"/>
-          <w:sz w:val="22"/>
-          <w:szCs w:val="22"/>
-        </w:rPr>
-        <w:t>acceso</w:t>
-      </w:r>
-      <w:proofErr w:type="gramEnd"/>
-      <w:r>
-        <w:rPr>
-          <w:rFonts w:ascii="Arial" w:eastAsia="Arial" w:hAnsi="Arial" w:cs="Arial"/>
-          <w:sz w:val="22"/>
-          <w:szCs w:val="22"/>
-        </w:rPr>
-        <w:t xml:space="preserve"> aunque su token no haya expirado.</w:t>
+          <w:rFonts w:ascii="Arial" w:cs="Arial" w:eastAsia="Arial" w:hAnsi="Arial"/>
+          <w:b/>
+          <w:bCs/>
+          <w:sz w:val="22"/>
+          <w:szCs w:val="22"/>
+        </w:rPr>
+        <w:t xml:space="preserve">AC1:</w:t>
+      </w:r>
+      <w:r>
+        <w:rPr>
+          <w:rFonts w:ascii="Arial" w:cs="Arial" w:eastAsia="Arial" w:hAnsi="Arial"/>
+          <w:sz w:val="22"/>
+          <w:szCs w:val="22"/>
+        </w:rPr>
+        <w:t xml:space="preserve"> Dado que un usuario ingresa credenciales válidas en la pantalla de login, cuando el sistema las valida, entonces debe entregarle un JWT firmado, con expiración de 30 minutos y su rol, guardado en una cookie HttpOnly, y llevarlo al panel de su rol.</w:t>
+      </w:r>
+    </w:p>
+    <w:p>
+      <w:pPr>
+        <w:spacing w:after="120"/>
+        <w:ind w:left="720"/>
+      </w:pPr>
+      <w:r>
+        <w:rPr>
+          <w:rFonts w:ascii="Arial" w:cs="Arial" w:eastAsia="Arial" w:hAnsi="Arial"/>
+          <w:b/>
+          <w:bCs/>
+          <w:sz w:val="22"/>
+          <w:szCs w:val="22"/>
+        </w:rPr>
+        <w:t xml:space="preserve">AC2:</w:t>
+      </w:r>
+      <w:r>
+        <w:rPr>
+          <w:rFonts w:ascii="Arial" w:cs="Arial" w:eastAsia="Arial" w:hAnsi="Arial"/>
+          <w:sz w:val="22"/>
+          <w:szCs w:val="22"/>
+        </w:rPr>
+        <w:t xml:space="preserve"> Cuando las credenciales son inválidas, entonces el sistema debe mostrar un mensaje genérico, sin revelar si el correo existe.</w:t>
+      </w:r>
+    </w:p>
+    <w:p>
+      <w:pPr>
+        <w:spacing w:after="120"/>
+        <w:ind w:left="720"/>
+      </w:pPr>
+      <w:r>
+        <w:rPr>
+          <w:rFonts w:ascii="Arial" w:cs="Arial" w:eastAsia="Arial" w:hAnsi="Arial"/>
+          <w:b/>
+          <w:bCs/>
+          <w:sz w:val="22"/>
+          <w:szCs w:val="22"/>
+        </w:rPr>
+        <w:t xml:space="preserve">AC3:</w:t>
+      </w:r>
+      <w:r>
+        <w:rPr>
+          <w:rFonts w:ascii="Arial" w:cs="Arial" w:eastAsia="Arial" w:hAnsi="Arial"/>
+          <w:sz w:val="22"/>
+          <w:szCs w:val="22"/>
+        </w:rPr>
+        <w:t xml:space="preserve"> En cada petición, el sistema debe verificar que el usuario siga habilitado y tomar su rol de la base de datos, de modo que una cuenta deshabilitada o con el rol cambiado pierda acceso aunque su token no haya expirado.</w:t>
+      </w:r>
+    </w:p>
+    <w:p>
+      <w:pPr>
+        <w:spacing w:after="120"/>
+        <w:ind w:left="720"/>
+      </w:pPr>
+      <w:r>
+        <w:rPr>
+          <w:rFonts w:ascii="Arial" w:cs="Arial" w:eastAsia="Arial" w:hAnsi="Arial"/>
+          <w:b/>
+          <w:bCs/>
+          <w:sz w:val="22"/>
+          <w:szCs w:val="22"/>
+        </w:rPr>
+        <w:t xml:space="preserve">AC4:</w:t>
+      </w:r>
+      <w:r>
+        <w:rPr>
+          <w:rFonts w:ascii="Arial" w:cs="Arial" w:eastAsia="Arial" w:hAnsi="Arial"/>
+          <w:sz w:val="22"/>
+          <w:szCs w:val="22"/>
+        </w:rPr>
+        <w:t xml:space="preserve"> Al cerrar sesión, el sistema debe borrar la cookie del token; un token manipulado o vencido debe rechazarse.</w:t>
       </w:r>
     </w:p>
     <w:p>
@@ -559,47 +409,11 @@
       </w:pPr>
       <w:r>
         <w:rPr>
-          <w:rFonts w:ascii="Arial" w:eastAsia="Arial" w:hAnsi="Arial" w:cs="Arial"/>
-          <w:sz w:val="22"/>
-          <w:szCs w:val="22"/>
-        </w:rPr>
-        <w:t>TASK-01: Agregar dependencia JWT (</w:t>
-      </w:r>
-      <w:proofErr w:type="spellStart"/>
-      <w:r>
-        <w:rPr>
-          <w:rFonts w:ascii="Arial" w:eastAsia="Arial" w:hAnsi="Arial" w:cs="Arial"/>
-          <w:sz w:val="22"/>
-          <w:szCs w:val="22"/>
-        </w:rPr>
-        <w:t>jjwt</w:t>
-      </w:r>
-      <w:proofErr w:type="spellEnd"/>
-      <w:r>
-        <w:rPr>
-          <w:rFonts w:ascii="Arial" w:eastAsia="Arial" w:hAnsi="Arial" w:cs="Arial"/>
-          <w:sz w:val="22"/>
-          <w:szCs w:val="22"/>
-        </w:rPr>
-        <w:t xml:space="preserve">); clave de firma y tiempo de expiración como variables de entorno (18-19 </w:t>
-      </w:r>
-      <w:proofErr w:type="spellStart"/>
-      <w:r>
-        <w:rPr>
-          <w:rFonts w:ascii="Arial" w:eastAsia="Arial" w:hAnsi="Arial" w:cs="Arial"/>
-          <w:sz w:val="22"/>
-          <w:szCs w:val="22"/>
-        </w:rPr>
-        <w:t>sep</w:t>
-      </w:r>
-      <w:proofErr w:type="spellEnd"/>
-      <w:r>
-        <w:rPr>
-          <w:rFonts w:ascii="Arial" w:eastAsia="Arial" w:hAnsi="Arial" w:cs="Arial"/>
-          <w:sz w:val="22"/>
-          <w:szCs w:val="22"/>
-        </w:rPr>
-        <w:t>)</w:t>
+          <w:rFonts w:ascii="Arial" w:cs="Arial" w:eastAsia="Arial" w:hAnsi="Arial"/>
+          <w:sz w:val="22"/>
+          <w:szCs w:val="22"/>
+        </w:rPr>
+        <w:t xml:space="preserve">TASK-01: Agregar la librería JWT (jjwt), con la clave de firma y el tiempo de expiración como variables de entorno; la app no arranca en producción con la clave de desarrollo (18-19 sep)</w:t>
       </w:r>
     </w:p>
     <w:p>
@@ -613,65 +427,11 @@
       </w:pPr>
       <w:r>
         <w:rPr>
-          <w:rFonts w:ascii="Arial" w:eastAsia="Arial" w:hAnsi="Arial" w:cs="Arial"/>
-          <w:sz w:val="22"/>
-          <w:szCs w:val="22"/>
-        </w:rPr>
-        <w:t>TASK-02: Implementar POST /api/</w:t>
-      </w:r>
-      <w:proofErr w:type="spellStart"/>
-      <w:r>
-        <w:rPr>
-          <w:rFonts w:ascii="Arial" w:eastAsia="Arial" w:hAnsi="Arial" w:cs="Arial"/>
-          <w:sz w:val="22"/>
-          <w:szCs w:val="22"/>
-        </w:rPr>
-        <w:t>auth</w:t>
-      </w:r>
-      <w:proofErr w:type="spellEnd"/>
-      <w:r>
-        <w:rPr>
-          <w:rFonts w:ascii="Arial" w:eastAsia="Arial" w:hAnsi="Arial" w:cs="Arial"/>
-          <w:sz w:val="22"/>
-          <w:szCs w:val="22"/>
-        </w:rPr>
-        <w:t>/</w:t>
-      </w:r>
-      <w:proofErr w:type="spellStart"/>
-      <w:r>
-        <w:rPr>
-          <w:rFonts w:ascii="Arial" w:eastAsia="Arial" w:hAnsi="Arial" w:cs="Arial"/>
-          <w:sz w:val="22"/>
-          <w:szCs w:val="22"/>
-        </w:rPr>
-        <w:t>login</w:t>
-      </w:r>
-      <w:proofErr w:type="spellEnd"/>
-      <w:r>
-        <w:rPr>
-          <w:rFonts w:ascii="Arial" w:eastAsia="Arial" w:hAnsi="Arial" w:cs="Arial"/>
-          <w:sz w:val="22"/>
-          <w:szCs w:val="22"/>
-        </w:rPr>
-        <w:t xml:space="preserve"> y generación del token (20-22 </w:t>
-      </w:r>
-      <w:proofErr w:type="spellStart"/>
-      <w:r>
-        <w:rPr>
-          <w:rFonts w:ascii="Arial" w:eastAsia="Arial" w:hAnsi="Arial" w:cs="Arial"/>
-          <w:sz w:val="22"/>
-          <w:szCs w:val="22"/>
-        </w:rPr>
-        <w:t>sep</w:t>
-      </w:r>
-      <w:proofErr w:type="spellEnd"/>
-      <w:r>
-        <w:rPr>
-          <w:rFonts w:ascii="Arial" w:eastAsia="Arial" w:hAnsi="Arial" w:cs="Arial"/>
-          <w:sz w:val="22"/>
-          <w:szCs w:val="22"/>
-        </w:rPr>
-        <w:t>)</w:t>
+          <w:rFonts w:ascii="Arial" w:cs="Arial" w:eastAsia="Arial" w:hAnsi="Arial"/>
+          <w:sz w:val="22"/>
+          <w:szCs w:val="22"/>
+        </w:rPr>
+        <w:t xml:space="preserve">TASK-02: Generar el JWT al iniciar sesión y entregarlo en una cookie HttpOnly (LoginSuccessHandler) (20-22 sep)</w:t>
       </w:r>
     </w:p>
     <w:p>
@@ -685,73 +445,11 @@
       </w:pPr>
       <w:r>
         <w:rPr>
-          <w:rFonts w:ascii="Arial" w:eastAsia="Arial" w:hAnsi="Arial" w:cs="Arial"/>
-          <w:sz w:val="22"/>
-          <w:szCs w:val="22"/>
-        </w:rPr>
-        <w:t xml:space="preserve">TASK-03: Implementar </w:t>
-      </w:r>
-      <w:proofErr w:type="spellStart"/>
-      <w:r>
-        <w:rPr>
-          <w:rFonts w:ascii="Arial" w:eastAsia="Arial" w:hAnsi="Arial" w:cs="Arial"/>
-          <w:sz w:val="22"/>
-          <w:szCs w:val="22"/>
-        </w:rPr>
-        <w:t>JwtAuthenticationFilter</w:t>
-      </w:r>
-      <w:proofErr w:type="spellEnd"/>
-      <w:r>
-        <w:rPr>
-          <w:rFonts w:ascii="Arial" w:eastAsia="Arial" w:hAnsi="Arial" w:cs="Arial"/>
-          <w:sz w:val="22"/>
-          <w:szCs w:val="22"/>
-        </w:rPr>
-        <w:t xml:space="preserve"> con verificación</w:t>
-      </w:r>
-      <w:r>
-        <w:rPr>
-          <w:rFonts w:ascii="Arial" w:eastAsia="Arial" w:hAnsi="Arial" w:cs="Arial"/>
-          <w:sz w:val="22"/>
-          <w:szCs w:val="22"/>
-        </w:rPr>
-        <w:t xml:space="preserve"> de usuario habilitado en cada </w:t>
-      </w:r>
-      <w:proofErr w:type="spellStart"/>
-      <w:r>
-        <w:rPr>
-          <w:rFonts w:ascii="Arial" w:eastAsia="Arial" w:hAnsi="Arial" w:cs="Arial"/>
-          <w:sz w:val="22"/>
-          <w:szCs w:val="22"/>
-        </w:rPr>
-        <w:t>request</w:t>
-      </w:r>
-      <w:proofErr w:type="spellEnd"/>
-      <w:r>
-        <w:rPr>
-          <w:rFonts w:ascii="Arial" w:eastAsia="Arial" w:hAnsi="Arial" w:cs="Arial"/>
-          <w:sz w:val="22"/>
-          <w:szCs w:val="22"/>
-        </w:rPr>
-        <w:t xml:space="preserve"> (23-25 </w:t>
-      </w:r>
-      <w:proofErr w:type="spellStart"/>
-      <w:r>
-        <w:rPr>
-          <w:rFonts w:ascii="Arial" w:eastAsia="Arial" w:hAnsi="Arial" w:cs="Arial"/>
-          <w:sz w:val="22"/>
-          <w:szCs w:val="22"/>
-        </w:rPr>
-        <w:t>sep</w:t>
-      </w:r>
-      <w:proofErr w:type="spellEnd"/>
-      <w:r>
-        <w:rPr>
-          <w:rFonts w:ascii="Arial" w:eastAsia="Arial" w:hAnsi="Arial" w:cs="Arial"/>
-          <w:sz w:val="22"/>
-          <w:szCs w:val="22"/>
-        </w:rPr>
-        <w:t>)</w:t>
+          <w:rFonts w:ascii="Arial" w:cs="Arial" w:eastAsia="Arial" w:hAnsi="Arial"/>
+          <w:sz w:val="22"/>
+          <w:szCs w:val="22"/>
+        </w:rPr>
+        <w:t xml:space="preserve">TASK-03: Filtro JwtCookieAuthenticationFilter: leer la cookie, validar el token y verificar en cada petición que el usuario siga habilitado y con el mismo rol (23-25 sep)</w:t>
       </w:r>
     </w:p>
     <w:p>
@@ -765,101 +463,11 @@
       </w:pPr>
       <w:r>
         <w:rPr>
-          <w:rFonts w:ascii="Arial" w:eastAsia="Arial" w:hAnsi="Arial" w:cs="Arial"/>
-          <w:sz w:val="22"/>
-          <w:szCs w:val="22"/>
-        </w:rPr>
-        <w:t xml:space="preserve">TASK-04: Configurar dos </w:t>
-      </w:r>
-      <w:proofErr w:type="spellStart"/>
-      <w:r>
-        <w:rPr>
-          <w:rFonts w:ascii="Arial" w:eastAsia="Arial" w:hAnsi="Arial" w:cs="Arial"/>
-          <w:sz w:val="22"/>
-          <w:szCs w:val="22"/>
-        </w:rPr>
-        <w:t>SecurityFilterChain</w:t>
-      </w:r>
-      <w:proofErr w:type="spellEnd"/>
-      <w:r>
-        <w:rPr>
-          <w:rFonts w:ascii="Arial" w:eastAsia="Arial" w:hAnsi="Arial" w:cs="Arial"/>
-          <w:sz w:val="22"/>
-          <w:szCs w:val="22"/>
-        </w:rPr>
-        <w:t xml:space="preserve">: /api/** </w:t>
-      </w:r>
-      <w:proofErr w:type="spellStart"/>
-      <w:r>
-        <w:rPr>
-          <w:rFonts w:ascii="Arial" w:eastAsia="Arial" w:hAnsi="Arial" w:cs="Arial"/>
-          <w:sz w:val="22"/>
-          <w:szCs w:val="22"/>
-        </w:rPr>
-        <w:t>stateless</w:t>
-      </w:r>
-      <w:proofErr w:type="spellEnd"/>
-      <w:r>
-        <w:rPr>
-          <w:rFonts w:ascii="Arial" w:eastAsia="Arial" w:hAnsi="Arial" w:cs="Arial"/>
-          <w:sz w:val="22"/>
-          <w:szCs w:val="22"/>
-        </w:rPr>
-        <w:t xml:space="preserve"> sin CSRF, autenticada por cabecera </w:t>
-      </w:r>
-      <w:proofErr w:type="spellStart"/>
-      <w:r>
-        <w:rPr>
-          <w:rFonts w:ascii="Arial" w:eastAsia="Arial" w:hAnsi="Arial" w:cs="Arial"/>
-          <w:sz w:val="22"/>
-          <w:szCs w:val="22"/>
-        </w:rPr>
-        <w:t>Authorization</w:t>
-      </w:r>
-      <w:proofErr w:type="spellEnd"/>
-      <w:r>
-        <w:rPr>
-          <w:rFonts w:ascii="Arial" w:eastAsia="Arial" w:hAnsi="Arial" w:cs="Arial"/>
-          <w:sz w:val="22"/>
-          <w:szCs w:val="22"/>
-        </w:rPr>
-        <w:t xml:space="preserve">, y la aplicación web con el JWT en una cookie </w:t>
-      </w:r>
-      <w:proofErr w:type="spellStart"/>
-      <w:r>
-        <w:rPr>
-          <w:rFonts w:ascii="Arial" w:eastAsia="Arial" w:hAnsi="Arial" w:cs="Arial"/>
-          <w:sz w:val="22"/>
-          <w:szCs w:val="22"/>
-        </w:rPr>
-        <w:t>HttpOnly</w:t>
-      </w:r>
-      <w:proofErr w:type="spellEnd"/>
-      <w:r>
-        <w:rPr>
-          <w:rFonts w:ascii="Arial" w:eastAsia="Arial" w:hAnsi="Arial" w:cs="Arial"/>
-          <w:sz w:val="22"/>
-          <w:szCs w:val="22"/>
-        </w:rPr>
-        <w:t xml:space="preserve"> (26-27 </w:t>
-      </w:r>
-      <w:proofErr w:type="spellStart"/>
-      <w:r>
-        <w:rPr>
-          <w:rFonts w:ascii="Arial" w:eastAsia="Arial" w:hAnsi="Arial" w:cs="Arial"/>
-          <w:sz w:val="22"/>
-          <w:szCs w:val="22"/>
-        </w:rPr>
-        <w:t>sep</w:t>
-      </w:r>
-      <w:proofErr w:type="spellEnd"/>
-      <w:r>
-        <w:rPr>
-          <w:rFonts w:ascii="Arial" w:eastAsia="Arial" w:hAnsi="Arial" w:cs="Arial"/>
-          <w:sz w:val="22"/>
-          <w:szCs w:val="22"/>
-        </w:rPr>
-        <w:t>)</w:t>
+          <w:rFonts w:ascii="Arial" w:cs="Arial" w:eastAsia="Arial" w:hAnsi="Arial"/>
+          <w:sz w:val="22"/>
+          <w:szCs w:val="22"/>
+        </w:rPr>
+        <w:t xml:space="preserve">TASK-04: Configurar Spring Security sin sesión de servidor, con el token CSRF en su propia cookie y un cierre de sesión que borra el JWT (26-27 sep)</w:t>
       </w:r>
     </w:p>
     <w:p>
@@ -870,30 +478,21 @@
       </w:pPr>
       <w:r>
         <w:rPr>
-          <w:rFonts w:ascii="Arial" w:eastAsia="Arial" w:hAnsi="Arial" w:cs="Arial"/>
-          <w:b/>
-          <w:bCs/>
-          <w:sz w:val="22"/>
-          <w:szCs w:val="22"/>
-        </w:rPr>
-        <w:lastRenderedPageBreak/>
-        <w:t>US-02:</w:t>
-      </w:r>
-      <w:r>
-        <w:rPr>
-          <w:rFonts w:ascii="Arial" w:eastAsia="Arial" w:hAnsi="Arial" w:cs="Arial"/>
-          <w:sz w:val="22"/>
-          <w:szCs w:val="22"/>
-        </w:rPr>
-        <w:t xml:space="preserve"> Registro de usuario</w:t>
-      </w:r>
-      <w:r>
-        <w:rPr>
-          <w:rFonts w:ascii="Arial" w:eastAsia="Arial" w:hAnsi="Arial" w:cs="Arial"/>
-          <w:sz w:val="22"/>
-          <w:szCs w:val="22"/>
-        </w:rPr>
-        <w:t xml:space="preserve"> vía API – 5 Puntos (Como cliente nuevo quiero registrarme a través de la API para que mi cuenta quede disponible tanto para el flujo web actual como para futuros clientes de la API)</w:t>
+          <w:rFonts w:ascii="Arial" w:cs="Arial" w:eastAsia="Arial" w:hAnsi="Arial"/>
+          <w:b/>
+          <w:bCs/>
+          <w:sz w:val="22"/>
+          <w:szCs w:val="22"/>
+        </w:rPr>
+        <w:t xml:space="preserve">US-02:</w:t>
+      </w:r>
+      <w:r>
+        <w:rPr>
+          <w:rFonts w:ascii="Arial" w:cs="Arial" w:eastAsia="Arial" w:hAnsi="Arial"/>
+          <w:sz w:val="22"/>
+          <w:szCs w:val="22"/>
+        </w:rPr>
+        <w:t xml:space="preserve"> Integración del equipo y pruebas aisladas de la base de datos real – 5 Puntos (Como equipo queremos unir el trabajo de ambos integrantes y tener pruebas automáticas que no toquen la base de datos real, para avanzar con seguridad en los siguientes sprints)</w:t>
       </w:r>
     </w:p>
     <w:p>
@@ -920,119 +519,69 @@
       </w:pPr>
       <w:r>
         <w:rPr>
-          <w:rFonts w:ascii="Arial" w:eastAsia="Arial" w:hAnsi="Arial" w:cs="Arial"/>
-          <w:b/>
-          <w:bCs/>
-          <w:sz w:val="22"/>
-          <w:szCs w:val="22"/>
-        </w:rPr>
-        <w:t>AC1:</w:t>
-      </w:r>
-      <w:r>
-        <w:rPr>
-          <w:rFonts w:ascii="Arial" w:eastAsia="Arial" w:hAnsi="Arial" w:cs="Arial"/>
-          <w:sz w:val="22"/>
-          <w:szCs w:val="22"/>
-        </w:rPr>
-        <w:t xml:space="preserve"> Dado que un visitante envía POST /api/</w:t>
-      </w:r>
-      <w:proofErr w:type="spellStart"/>
-      <w:r>
-        <w:rPr>
-          <w:rFonts w:ascii="Arial" w:eastAsia="Arial" w:hAnsi="Arial" w:cs="Arial"/>
-          <w:sz w:val="22"/>
-          <w:szCs w:val="22"/>
-        </w:rPr>
-        <w:t>auth</w:t>
-      </w:r>
-      <w:proofErr w:type="spellEnd"/>
-      <w:r>
-        <w:rPr>
-          <w:rFonts w:ascii="Arial" w:eastAsia="Arial" w:hAnsi="Arial" w:cs="Arial"/>
-          <w:sz w:val="22"/>
-          <w:szCs w:val="22"/>
-        </w:rPr>
-        <w:t>/</w:t>
-      </w:r>
-      <w:r>
-        <w:rPr>
-          <w:rFonts w:ascii="Arial" w:eastAsia="Arial" w:hAnsi="Arial" w:cs="Arial"/>
-          <w:sz w:val="22"/>
-          <w:szCs w:val="22"/>
-        </w:rPr>
-        <w:t>registro con datos válidos, cuando el sistema los valida, entonces debe crear el usuario con rol CLIENTE y devolver un JWT.</w:t>
-      </w:r>
-    </w:p>
-    <w:p>
-      <w:pPr>
-        <w:spacing w:after="120"/>
-        <w:ind w:left="720"/>
-      </w:pPr>
-      <w:r>
-        <w:rPr>
-          <w:rFonts w:ascii="Arial" w:eastAsia="Arial" w:hAnsi="Arial" w:cs="Arial"/>
-          <w:b/>
-          <w:bCs/>
-          <w:sz w:val="22"/>
-          <w:szCs w:val="22"/>
-        </w:rPr>
-        <w:t>AC2:</w:t>
-      </w:r>
-      <w:r>
-        <w:rPr>
-          <w:rFonts w:ascii="Arial" w:eastAsia="Arial" w:hAnsi="Arial" w:cs="Arial"/>
-          <w:sz w:val="22"/>
-          <w:szCs w:val="22"/>
-        </w:rPr>
-        <w:t xml:space="preserve"> Cuando el correo ya está registrado, entonces el sistema debe responder 409 indicando que el correo ya está en uso.</w:t>
-      </w:r>
-    </w:p>
-    <w:p>
-      <w:pPr>
-        <w:spacing w:after="120"/>
-        <w:ind w:left="720"/>
-      </w:pPr>
-      <w:r>
-        <w:rPr>
-          <w:rFonts w:ascii="Arial" w:eastAsia="Arial" w:hAnsi="Arial" w:cs="Arial"/>
-          <w:b/>
-          <w:bCs/>
-          <w:sz w:val="22"/>
-          <w:szCs w:val="22"/>
-        </w:rPr>
-        <w:t>AC3:</w:t>
-      </w:r>
-      <w:r>
-        <w:rPr>
-          <w:rFonts w:ascii="Arial" w:eastAsia="Arial" w:hAnsi="Arial" w:cs="Arial"/>
-          <w:sz w:val="22"/>
-          <w:szCs w:val="22"/>
-        </w:rPr>
-        <w:t xml:space="preserve"> Cuando falta un campo obligatorio (nombre, cédula, placa, correo o contraseña), entonces debe responder 400 con el detalle del campo faltante.</w:t>
-      </w:r>
-    </w:p>
-    <w:p>
-      <w:pPr>
-        <w:spacing w:after="120"/>
-        <w:ind w:left="720"/>
-      </w:pPr>
-      <w:r>
-        <w:rPr>
-          <w:rFonts w:ascii="Arial" w:eastAsia="Arial" w:hAnsi="Arial" w:cs="Arial"/>
-          <w:b/>
-          <w:bCs/>
-          <w:sz w:val="22"/>
-          <w:szCs w:val="22"/>
-        </w:rPr>
-        <w:t>AC4:</w:t>
-      </w:r>
-      <w:r>
-        <w:rPr>
-          <w:rFonts w:ascii="Arial" w:eastAsia="Arial" w:hAnsi="Arial" w:cs="Arial"/>
-          <w:sz w:val="22"/>
-          <w:szCs w:val="22"/>
-        </w:rPr>
-        <w:t xml:space="preserve"> Las pruebas automáticas de autenticación deben ejecutarse sin tocar la base de datos real de producción.</w:t>
+          <w:rFonts w:ascii="Arial" w:cs="Arial" w:eastAsia="Arial" w:hAnsi="Arial"/>
+          <w:b/>
+          <w:bCs/>
+          <w:sz w:val="22"/>
+          <w:szCs w:val="22"/>
+        </w:rPr>
+        <w:t xml:space="preserve">AC1:</w:t>
+      </w:r>
+      <w:r>
+        <w:rPr>
+          <w:rFonts w:ascii="Arial" w:cs="Arial" w:eastAsia="Arial" w:hAnsi="Arial"/>
+          <w:sz w:val="22"/>
+          <w:szCs w:val="22"/>
+        </w:rPr>
+        <w:t xml:space="preserve"> Las pruebas automáticas deben ejecutarse contra una base de datos MongoDB embebida, nunca contra la base de datos real de producción.</w:t>
+      </w:r>
+    </w:p>
+    <w:p>
+      <w:pPr>
+        <w:spacing w:after="120"/>
+        <w:ind w:left="720"/>
+      </w:pPr>
+      <w:r>
+        <w:rPr>
+          <w:rFonts w:ascii="Arial" w:cs="Arial" w:eastAsia="Arial" w:hAnsi="Arial"/>
+          <w:b/>
+          <w:bCs/>
+          <w:sz w:val="22"/>
+          <w:szCs w:val="22"/>
+        </w:rPr>
+        <w:t xml:space="preserve">AC2:</w:t>
+      </w:r>
+      <w:r>
+        <w:rPr>
+          <w:rFonts w:ascii="Arial" w:cs="Arial" w:eastAsia="Arial" w:hAnsi="Arial"/>
+          <w:sz w:val="22"/>
+          <w:szCs w:val="22"/>
+        </w:rPr>
+        <w:t xml:space="preserve"> Debe haber pruebas del login web real: entrega la cookie, sin cookie no se accede, el cierre de sesión la borra y un token manipulado se rechaza.</w:t>
+      </w:r>
+    </w:p>
+    <w:p>
+      <w:pPr>
+        <w:spacing w:after="120"/>
+        <w:ind w:left="720"/>
+      </w:pPr>
+      <w:r>
+        <w:rPr>
+          <w:rFonts w:ascii="Arial" w:cs="Arial" w:eastAsia="Arial" w:hAnsi="Arial"/>
+          <w:b/>
+          <w:bCs/>
+          <w:sz w:val="22"/>
+          <w:szCs w:val="22"/>
+        </w:rPr>
+        <w:t xml:space="preserve">AC3:</w:t>
+      </w:r>
+      <w:r>
+        <w:rPr>
+          <w:rFonts w:ascii="Arial" w:cs="Arial" w:eastAsia="Arial" w:hAnsi="Arial"/>
+          <w:sz w:val="22"/>
+          <w:szCs w:val="22"/>
+        </w:rPr>
+        <w:t xml:space="preserve"> Debe haber pruebas unitarias de las reglas de negocio (tarifas, reservas, entradas y salidas).</w:t>
       </w:r>
     </w:p>
     <w:p>
@@ -1049,17 +598,7 @@
           <w:sz w:val="22"/>
           <w:szCs w:val="22"/>
         </w:rPr>
-        <w:t>Ta</w:t>
-      </w:r>
-      <w:r>
-        <w:rPr>
-          <w:rFonts w:ascii="Arial" w:eastAsia="Arial" w:hAnsi="Arial" w:cs="Arial"/>
-          <w:b/>
-          <w:bCs/>
-          <w:sz w:val="22"/>
-          <w:szCs w:val="22"/>
-        </w:rPr>
-        <w:t>reas:</w:t>
+        <w:t>Tareas:</w:t>
       </w:r>
     </w:p>
     <w:p>
@@ -1073,65 +612,11 @@
       </w:pPr>
       <w:r>
         <w:rPr>
-          <w:rFonts w:ascii="Arial" w:eastAsia="Arial" w:hAnsi="Arial" w:cs="Arial"/>
-          <w:sz w:val="22"/>
-          <w:szCs w:val="22"/>
-        </w:rPr>
-        <w:t xml:space="preserve">TASK-05: </w:t>
-      </w:r>
-      <w:proofErr w:type="spellStart"/>
-      <w:r>
-        <w:rPr>
-          <w:rFonts w:ascii="Arial" w:eastAsia="Arial" w:hAnsi="Arial" w:cs="Arial"/>
-          <w:sz w:val="22"/>
-          <w:szCs w:val="22"/>
-        </w:rPr>
-        <w:t>Endpoint</w:t>
-      </w:r>
-      <w:proofErr w:type="spellEnd"/>
-      <w:r>
-        <w:rPr>
-          <w:rFonts w:ascii="Arial" w:eastAsia="Arial" w:hAnsi="Arial" w:cs="Arial"/>
-          <w:sz w:val="22"/>
-          <w:szCs w:val="22"/>
-        </w:rPr>
-        <w:t xml:space="preserve"> POST /api/</w:t>
-      </w:r>
-      <w:proofErr w:type="spellStart"/>
-      <w:r>
-        <w:rPr>
-          <w:rFonts w:ascii="Arial" w:eastAsia="Arial" w:hAnsi="Arial" w:cs="Arial"/>
-          <w:sz w:val="22"/>
-          <w:szCs w:val="22"/>
-        </w:rPr>
-        <w:t>auth</w:t>
-      </w:r>
-      <w:proofErr w:type="spellEnd"/>
-      <w:r>
-        <w:rPr>
-          <w:rFonts w:ascii="Arial" w:eastAsia="Arial" w:hAnsi="Arial" w:cs="Arial"/>
-          <w:sz w:val="22"/>
-          <w:szCs w:val="22"/>
-        </w:rPr>
-        <w:t xml:space="preserve">/registro reutilizando el servicio de usuarios existente (28 </w:t>
-      </w:r>
-      <w:proofErr w:type="spellStart"/>
-      <w:r>
-        <w:rPr>
-          <w:rFonts w:ascii="Arial" w:eastAsia="Arial" w:hAnsi="Arial" w:cs="Arial"/>
-          <w:sz w:val="22"/>
-          <w:szCs w:val="22"/>
-        </w:rPr>
-        <w:t>sep</w:t>
-      </w:r>
-      <w:proofErr w:type="spellEnd"/>
-      <w:r>
-        <w:rPr>
-          <w:rFonts w:ascii="Arial" w:eastAsia="Arial" w:hAnsi="Arial" w:cs="Arial"/>
-          <w:sz w:val="22"/>
-          <w:szCs w:val="22"/>
-        </w:rPr>
-        <w:t>)</w:t>
+          <w:rFonts w:ascii="Arial" w:cs="Arial" w:eastAsia="Arial" w:hAnsi="Arial"/>
+          <w:sz w:val="22"/>
+          <w:szCs w:val="22"/>
+        </w:rPr>
+        <w:t xml:space="preserve">TASK-05: Fusionar las mejoras de seguridad e interfaz del compañero y pasar la configuración a application.yml con perfiles de desarrollo y producción (28 sep)</w:t>
       </w:r>
     </w:p>
     <w:p>
@@ -1145,65 +630,11 @@
       </w:pPr>
       <w:r>
         <w:rPr>
-          <w:rFonts w:ascii="Arial" w:eastAsia="Arial" w:hAnsi="Arial" w:cs="Arial"/>
-          <w:sz w:val="22"/>
-          <w:szCs w:val="22"/>
-        </w:rPr>
-        <w:t xml:space="preserve">TASK-06: Validaciones de entrada con </w:t>
-      </w:r>
-      <w:proofErr w:type="spellStart"/>
-      <w:r>
-        <w:rPr>
-          <w:rFonts w:ascii="Arial" w:eastAsia="Arial" w:hAnsi="Arial" w:cs="Arial"/>
-          <w:sz w:val="22"/>
-          <w:szCs w:val="22"/>
-        </w:rPr>
-        <w:t>Bean</w:t>
-      </w:r>
-      <w:proofErr w:type="spellEnd"/>
-      <w:r>
-        <w:rPr>
-          <w:rFonts w:ascii="Arial" w:eastAsia="Arial" w:hAnsi="Arial" w:cs="Arial"/>
-          <w:sz w:val="22"/>
-          <w:szCs w:val="22"/>
-        </w:rPr>
-        <w:t xml:space="preserve"> </w:t>
-      </w:r>
-      <w:proofErr w:type="spellStart"/>
-      <w:r>
-        <w:rPr>
-          <w:rFonts w:ascii="Arial" w:eastAsia="Arial" w:hAnsi="Arial" w:cs="Arial"/>
-          <w:sz w:val="22"/>
-          <w:szCs w:val="22"/>
-        </w:rPr>
-        <w:t>Validation</w:t>
-      </w:r>
-      <w:proofErr w:type="spellEnd"/>
-      <w:r>
-        <w:rPr>
-          <w:rFonts w:ascii="Arial" w:eastAsia="Arial" w:hAnsi="Arial" w:cs="Arial"/>
-          <w:sz w:val="22"/>
-          <w:szCs w:val="22"/>
-        </w:rPr>
-        <w:t xml:space="preserve"> (29 </w:t>
-      </w:r>
-      <w:proofErr w:type="spellStart"/>
-      <w:r>
-        <w:rPr>
-          <w:rFonts w:ascii="Arial" w:eastAsia="Arial" w:hAnsi="Arial" w:cs="Arial"/>
-          <w:sz w:val="22"/>
-          <w:szCs w:val="22"/>
-        </w:rPr>
-        <w:t>sep</w:t>
-      </w:r>
-      <w:proofErr w:type="spellEnd"/>
-      <w:r>
-        <w:rPr>
-          <w:rFonts w:ascii="Arial" w:eastAsia="Arial" w:hAnsi="Arial" w:cs="Arial"/>
-          <w:sz w:val="22"/>
-          <w:szCs w:val="22"/>
-        </w:rPr>
-        <w:t>)</w:t>
+          <w:rFonts w:ascii="Arial" w:cs="Arial" w:eastAsia="Arial" w:hAnsi="Arial"/>
+          <w:sz w:val="22"/>
+          <w:szCs w:val="22"/>
+        </w:rPr>
+        <w:t xml:space="preserve">TASK-06: Configurar la base de datos MongoDB embebida para las pruebas (29 sep)</w:t>
       </w:r>
     </w:p>
     <w:p>
@@ -1217,55 +648,11 @@
       </w:pPr>
       <w:r>
         <w:rPr>
-          <w:rFonts w:ascii="Arial" w:eastAsia="Arial" w:hAnsi="Arial" w:cs="Arial"/>
-          <w:sz w:val="22"/>
-          <w:szCs w:val="22"/>
-        </w:rPr>
-        <w:t>TASK-07: Configurar entorno de pruebas aislado de la base de datos real y pruebas de integ</w:t>
-      </w:r>
-      <w:r>
-        <w:rPr>
-          <w:rFonts w:ascii="Arial" w:eastAsia="Arial" w:hAnsi="Arial" w:cs="Arial"/>
-          <w:sz w:val="22"/>
-          <w:szCs w:val="22"/>
-        </w:rPr>
-        <w:t xml:space="preserve">ración de </w:t>
-      </w:r>
-      <w:proofErr w:type="spellStart"/>
-      <w:r>
-        <w:rPr>
-          <w:rFonts w:ascii="Arial" w:eastAsia="Arial" w:hAnsi="Arial" w:cs="Arial"/>
-          <w:sz w:val="22"/>
-          <w:szCs w:val="22"/>
-        </w:rPr>
-        <w:t>login</w:t>
-      </w:r>
-      <w:proofErr w:type="spellEnd"/>
-      <w:r>
-        <w:rPr>
-          <w:rFonts w:ascii="Arial" w:eastAsia="Arial" w:hAnsi="Arial" w:cs="Arial"/>
-          <w:sz w:val="22"/>
-          <w:szCs w:val="22"/>
-        </w:rPr>
-        <w:t xml:space="preserve"> y registro (30 </w:t>
-      </w:r>
-      <w:proofErr w:type="spellStart"/>
-      <w:r>
-        <w:rPr>
-          <w:rFonts w:ascii="Arial" w:eastAsia="Arial" w:hAnsi="Arial" w:cs="Arial"/>
-          <w:sz w:val="22"/>
-          <w:szCs w:val="22"/>
-        </w:rPr>
-        <w:t>sep</w:t>
-      </w:r>
-      <w:proofErr w:type="spellEnd"/>
-      <w:r>
-        <w:rPr>
-          <w:rFonts w:ascii="Arial" w:eastAsia="Arial" w:hAnsi="Arial" w:cs="Arial"/>
-          <w:sz w:val="22"/>
-          <w:szCs w:val="22"/>
-        </w:rPr>
-        <w:t xml:space="preserve"> - 1 oct)</w:t>
+          <w:rFonts w:ascii="Arial" w:cs="Arial" w:eastAsia="Arial" w:hAnsi="Arial"/>
+          <w:sz w:val="22"/>
+          <w:szCs w:val="22"/>
+        </w:rPr>
+        <w:t xml:space="preserve">TASK-07: Pruebas de integración del login web y pruebas unitarias de las reglas de negocio (30 sep - 1 oct)</w:t>
       </w:r>
     </w:p>
     <w:p>
@@ -2699,75 +2086,21 @@
       </w:pPr>
       <w:r>
         <w:rPr>
-          <w:rFonts w:ascii="Arial" w:eastAsia="Arial" w:hAnsi="Arial" w:cs="Arial"/>
-          <w:b/>
-          <w:bCs/>
-          <w:sz w:val="22"/>
-          <w:szCs w:val="22"/>
-        </w:rPr>
-        <w:t>AC3:</w:t>
-      </w:r>
-      <w:r>
-        <w:rPr>
-          <w:rFonts w:ascii="Arial" w:eastAsia="Arial" w:hAnsi="Arial" w:cs="Arial"/>
-          <w:sz w:val="22"/>
-          <w:szCs w:val="22"/>
-        </w:rPr>
-        <w:t xml:space="preserve"> El </w:t>
-      </w:r>
-      <w:proofErr w:type="spellStart"/>
-      <w:r>
-        <w:rPr>
-          <w:rFonts w:ascii="Arial" w:eastAsia="Arial" w:hAnsi="Arial" w:cs="Arial"/>
-          <w:sz w:val="22"/>
-          <w:szCs w:val="22"/>
-        </w:rPr>
-        <w:t>login</w:t>
-      </w:r>
-      <w:proofErr w:type="spellEnd"/>
-      <w:r>
-        <w:rPr>
-          <w:rFonts w:ascii="Arial" w:eastAsia="Arial" w:hAnsi="Arial" w:cs="Arial"/>
-          <w:sz w:val="22"/>
-          <w:szCs w:val="22"/>
-        </w:rPr>
-        <w:t xml:space="preserve"> web (cookie JWT), el </w:t>
-      </w:r>
-      <w:proofErr w:type="spellStart"/>
-      <w:r>
-        <w:rPr>
-          <w:rFonts w:ascii="Arial" w:eastAsia="Arial" w:hAnsi="Arial" w:cs="Arial"/>
-          <w:sz w:val="22"/>
-          <w:szCs w:val="22"/>
-        </w:rPr>
-        <w:t>login</w:t>
-      </w:r>
-      <w:proofErr w:type="spellEnd"/>
-      <w:r>
-        <w:rPr>
-          <w:rFonts w:ascii="Arial" w:eastAsia="Arial" w:hAnsi="Arial" w:cs="Arial"/>
-          <w:sz w:val="22"/>
-          <w:szCs w:val="22"/>
-        </w:rPr>
-        <w:t xml:space="preserve"> por la API JWT y el </w:t>
-      </w:r>
-      <w:proofErr w:type="spellStart"/>
-      <w:r>
-        <w:rPr>
-          <w:rFonts w:ascii="Arial" w:eastAsia="Arial" w:hAnsi="Arial" w:cs="Arial"/>
-          <w:sz w:val="22"/>
-          <w:szCs w:val="22"/>
-        </w:rPr>
-        <w:t>login</w:t>
-      </w:r>
-      <w:proofErr w:type="spellEnd"/>
-      <w:r>
-        <w:rPr>
-          <w:rFonts w:ascii="Arial" w:eastAsia="Arial" w:hAnsi="Arial" w:cs="Arial"/>
-          <w:sz w:val="22"/>
-          <w:szCs w:val="22"/>
-        </w:rPr>
-        <w:t xml:space="preserve"> con Google deben funcionar en la URL de Render.</w:t>
+          <w:rFonts w:ascii="Arial" w:cs="Arial" w:eastAsia="Arial" w:hAnsi="Arial"/>
+          <w:b/>
+          <w:bCs/>
+          <w:sz w:val="22"/>
+          <w:szCs w:val="22"/>
+        </w:rPr>
+        <w:t xml:space="preserve">AC3:</w:t>
+      </w:r>
+      <w:r>
+        <w:rPr>
+          <w:rFonts w:ascii="Arial" w:cs="Arial" w:eastAsia="Arial" w:hAnsi="Arial"/>
+          <w:sz w:val="22"/>
+          <w:szCs w:val="22"/>
+        </w:rPr>
+        <w:t xml:space="preserve"> El login web (cookie JWT) y el login con Google deben funcionar en la URL de Render.</w:t>
       </w:r>
     </w:p>
     <w:p>
@@ -3639,29 +2972,21 @@
       </w:pPr>
       <w:r>
         <w:rPr>
-          <w:rFonts w:ascii="Arial" w:eastAsia="Arial" w:hAnsi="Arial" w:cs="Arial"/>
-          <w:b/>
-          <w:bCs/>
-          <w:sz w:val="22"/>
-          <w:szCs w:val="22"/>
-        </w:rPr>
-        <w:t>US-15:</w:t>
-      </w:r>
-      <w:r>
-        <w:rPr>
-          <w:rFonts w:ascii="Arial" w:eastAsia="Arial" w:hAnsi="Arial" w:cs="Arial"/>
-          <w:sz w:val="22"/>
-          <w:szCs w:val="22"/>
-        </w:rPr>
-        <w:t xml:space="preserve"> Mapa de parqueaderos – 8 Puntos (Como cliente quiero ver los parq</w:t>
-      </w:r>
-      <w:r>
-        <w:rPr>
-          <w:rFonts w:ascii="Arial" w:eastAsia="Arial" w:hAnsi="Arial" w:cs="Arial"/>
-          <w:sz w:val="22"/>
-          <w:szCs w:val="22"/>
-        </w:rPr>
-        <w:t>ueaderos en un mapa, para elegir el más cercano a donde voy y reservar desde ahí)</w:t>
+          <w:rFonts w:ascii="Arial" w:cs="Arial" w:eastAsia="Arial" w:hAnsi="Arial"/>
+          <w:b/>
+          <w:bCs/>
+          <w:sz w:val="22"/>
+          <w:szCs w:val="22"/>
+        </w:rPr>
+        <w:t xml:space="preserve">US-11:</w:t>
+      </w:r>
+      <w:r>
+        <w:rPr>
+          <w:rFonts w:ascii="Arial" w:cs="Arial" w:eastAsia="Arial" w:hAnsi="Arial"/>
+          <w:sz w:val="22"/>
+          <w:szCs w:val="22"/>
+        </w:rPr>
+        <w:t xml:space="preserve"> Mapa de parqueaderos – 8 Puntos (Como cliente quiero ver los parqueaderos en un mapa, para elegir el más cercano a donde voy y reservar desde ahí)</w:t>
       </w:r>
     </w:p>
     <w:p>
@@ -3794,65 +3119,21 @@
       </w:pPr>
       <w:r>
         <w:rPr>
-          <w:rFonts w:ascii="Arial" w:eastAsia="Arial" w:hAnsi="Arial" w:cs="Arial"/>
-          <w:b/>
-          <w:bCs/>
-          <w:sz w:val="22"/>
-          <w:szCs w:val="22"/>
-        </w:rPr>
-        <w:t>AC4:</w:t>
-      </w:r>
-      <w:r>
-        <w:rPr>
-          <w:rFonts w:ascii="Arial" w:eastAsia="Arial" w:hAnsi="Arial" w:cs="Arial"/>
-          <w:sz w:val="22"/>
-          <w:szCs w:val="22"/>
-        </w:rPr>
-        <w:t xml:space="preserve"> El mapa debe usar </w:t>
-      </w:r>
-      <w:proofErr w:type="spellStart"/>
-      <w:r>
-        <w:rPr>
-          <w:rFonts w:ascii="Arial" w:eastAsia="Arial" w:hAnsi="Arial" w:cs="Arial"/>
-          <w:sz w:val="22"/>
-          <w:szCs w:val="22"/>
-        </w:rPr>
-        <w:t>Leaflet</w:t>
-      </w:r>
-      <w:proofErr w:type="spellEnd"/>
-      <w:r>
-        <w:rPr>
-          <w:rFonts w:ascii="Arial" w:eastAsia="Arial" w:hAnsi="Arial" w:cs="Arial"/>
-          <w:sz w:val="22"/>
-          <w:szCs w:val="22"/>
-        </w:rPr>
-        <w:t xml:space="preserve"> y </w:t>
-      </w:r>
-      <w:proofErr w:type="spellStart"/>
-      <w:r>
-        <w:rPr>
-          <w:rFonts w:ascii="Arial" w:eastAsia="Arial" w:hAnsi="Arial" w:cs="Arial"/>
-          <w:sz w:val="22"/>
-          <w:szCs w:val="22"/>
-        </w:rPr>
-        <w:t>OpenStreetMap</w:t>
-      </w:r>
-      <w:proofErr w:type="spellEnd"/>
-      <w:r>
-        <w:rPr>
-          <w:rFonts w:ascii="Arial" w:eastAsia="Arial" w:hAnsi="Arial" w:cs="Arial"/>
-          <w:sz w:val="22"/>
-          <w:szCs w:val="22"/>
-        </w:rPr>
-        <w:t>, sin claves de API, y la política de seguridad de contenido (CSP) solo debe perm</w:t>
-      </w:r>
-      <w:r>
-        <w:rPr>
-          <w:rFonts w:ascii="Arial" w:eastAsia="Arial" w:hAnsi="Arial" w:cs="Arial"/>
-          <w:sz w:val="22"/>
-          <w:szCs w:val="22"/>
-        </w:rPr>
-        <w:t>itir esos orígenes externos.</w:t>
+          <w:rFonts w:ascii="Arial" w:cs="Arial" w:eastAsia="Arial" w:hAnsi="Arial"/>
+          <w:b/>
+          <w:bCs/>
+          <w:sz w:val="22"/>
+          <w:szCs w:val="22"/>
+        </w:rPr>
+        <w:t xml:space="preserve">AC4:</w:t>
+      </w:r>
+      <w:r>
+        <w:rPr>
+          <w:rFonts w:ascii="Arial" w:cs="Arial" w:eastAsia="Arial" w:hAnsi="Arial"/>
+          <w:sz w:val="22"/>
+          <w:szCs w:val="22"/>
+        </w:rPr>
+        <w:t xml:space="preserve"> El mapa debe usar Leaflet y OpenStreetMap, sin registro ni claves de acceso, y la política de seguridad de contenido (CSP) solo debe permitir esos orígenes externos.</w:t>
       </w:r>
     </w:p>
     <w:p>
@@ -3883,47 +3164,11 @@
       </w:pPr>
       <w:r>
         <w:rPr>
-          <w:rFonts w:ascii="Arial" w:eastAsia="Arial" w:hAnsi="Arial" w:cs="Arial"/>
-          <w:sz w:val="22"/>
-          <w:szCs w:val="22"/>
-        </w:rPr>
-        <w:t xml:space="preserve">TASK-37: Campos de latitud y longitud en Parqueadero y </w:t>
-      </w:r>
-      <w:proofErr w:type="spellStart"/>
-      <w:r>
-        <w:rPr>
-          <w:rFonts w:ascii="Arial" w:eastAsia="Arial" w:hAnsi="Arial" w:cs="Arial"/>
-          <w:sz w:val="22"/>
-          <w:szCs w:val="22"/>
-        </w:rPr>
-        <w:t>mini-mapa</w:t>
-      </w:r>
-      <w:proofErr w:type="spellEnd"/>
-      <w:r>
-        <w:rPr>
-          <w:rFonts w:ascii="Arial" w:eastAsia="Arial" w:hAnsi="Arial" w:cs="Arial"/>
-          <w:sz w:val="22"/>
-          <w:szCs w:val="22"/>
-        </w:rPr>
-        <w:t xml:space="preserve"> </w:t>
-      </w:r>
-      <w:proofErr w:type="spellStart"/>
-      <w:r>
-        <w:rPr>
-          <w:rFonts w:ascii="Arial" w:eastAsia="Arial" w:hAnsi="Arial" w:cs="Arial"/>
-          <w:sz w:val="22"/>
-          <w:szCs w:val="22"/>
-        </w:rPr>
-        <w:t>Leaflet</w:t>
-      </w:r>
-      <w:proofErr w:type="spellEnd"/>
-      <w:r>
-        <w:rPr>
-          <w:rFonts w:ascii="Arial" w:eastAsia="Arial" w:hAnsi="Arial" w:cs="Arial"/>
-          <w:sz w:val="22"/>
-          <w:szCs w:val="22"/>
-        </w:rPr>
-        <w:t xml:space="preserve"> en la configuración del administrador para marcar la ubicación con un clic (21-23 oct)</w:t>
+          <w:rFonts w:ascii="Arial" w:cs="Arial" w:eastAsia="Arial" w:hAnsi="Arial"/>
+          <w:sz w:val="22"/>
+          <w:szCs w:val="22"/>
+        </w:rPr>
+        <w:t xml:space="preserve">TASK-28: Campos de latitud y longitud en Parqueadero y mini-mapa Leaflet en la configuración del administrador para marcar la ubicación con un clic (21-23 oct)</w:t>
       </w:r>
     </w:p>
     <w:p>
@@ -3937,19 +3182,11 @@
       </w:pPr>
       <w:r>
         <w:rPr>
-          <w:rFonts w:ascii="Arial" w:eastAsia="Arial" w:hAnsi="Arial" w:cs="Arial"/>
-          <w:sz w:val="22"/>
-          <w:szCs w:val="22"/>
-        </w:rPr>
-        <w:t>TASK-38: Asignar ubicación a los parqueaderos existentes de</w:t>
-      </w:r>
-      <w:r>
-        <w:rPr>
-          <w:rFonts w:ascii="Arial" w:eastAsia="Arial" w:hAnsi="Arial" w:cs="Arial"/>
-          <w:sz w:val="22"/>
-          <w:szCs w:val="22"/>
-        </w:rPr>
-        <w:t>sde la configuración de cada administrador (24 oct)</w:t>
+          <w:rFonts w:ascii="Arial" w:cs="Arial" w:eastAsia="Arial" w:hAnsi="Arial"/>
+          <w:sz w:val="22"/>
+          <w:szCs w:val="22"/>
+        </w:rPr>
+        <w:t xml:space="preserve">TASK-29: Asignar ubicación a los parqueaderos existentes desde la configuración de cada administrador (24 oct)</w:t>
       </w:r>
     </w:p>
     <w:p>
@@ -3963,65 +3200,11 @@
       </w:pPr>
       <w:r>
         <w:rPr>
-          <w:rFonts w:ascii="Arial" w:eastAsia="Arial" w:hAnsi="Arial" w:cs="Arial"/>
-          <w:sz w:val="22"/>
-          <w:szCs w:val="22"/>
-        </w:rPr>
-        <w:t xml:space="preserve">TASK-39: Mapa del cliente con un marcador por parqueadero habilitado y </w:t>
-      </w:r>
-      <w:proofErr w:type="spellStart"/>
-      <w:r>
-        <w:rPr>
-          <w:rFonts w:ascii="Arial" w:eastAsia="Arial" w:hAnsi="Arial" w:cs="Arial"/>
-          <w:sz w:val="22"/>
-          <w:szCs w:val="22"/>
-        </w:rPr>
-        <w:t>popup</w:t>
-      </w:r>
-      <w:proofErr w:type="spellEnd"/>
-      <w:r>
-        <w:rPr>
-          <w:rFonts w:ascii="Arial" w:eastAsia="Arial" w:hAnsi="Arial" w:cs="Arial"/>
-          <w:sz w:val="22"/>
-          <w:szCs w:val="22"/>
-        </w:rPr>
-        <w:t xml:space="preserve"> para reservar, ajustando la CSP para </w:t>
-      </w:r>
-      <w:proofErr w:type="spellStart"/>
-      <w:r>
-        <w:rPr>
-          <w:rFonts w:ascii="Arial" w:eastAsia="Arial" w:hAnsi="Arial" w:cs="Arial"/>
-          <w:sz w:val="22"/>
-          <w:szCs w:val="22"/>
-        </w:rPr>
-        <w:t>Leaflet</w:t>
-      </w:r>
-      <w:proofErr w:type="spellEnd"/>
-      <w:r>
-        <w:rPr>
-          <w:rFonts w:ascii="Arial" w:eastAsia="Arial" w:hAnsi="Arial" w:cs="Arial"/>
-          <w:sz w:val="22"/>
-          <w:szCs w:val="22"/>
-        </w:rPr>
-        <w:t xml:space="preserve"> y </w:t>
-      </w:r>
-      <w:proofErr w:type="spellStart"/>
-      <w:r>
-        <w:rPr>
-          <w:rFonts w:ascii="Arial" w:eastAsia="Arial" w:hAnsi="Arial" w:cs="Arial"/>
-          <w:sz w:val="22"/>
-          <w:szCs w:val="22"/>
-        </w:rPr>
-        <w:t>OpenStreetMap</w:t>
-      </w:r>
-      <w:proofErr w:type="spellEnd"/>
-      <w:r>
-        <w:rPr>
-          <w:rFonts w:ascii="Arial" w:eastAsia="Arial" w:hAnsi="Arial" w:cs="Arial"/>
-          <w:sz w:val="22"/>
-          <w:szCs w:val="22"/>
-        </w:rPr>
-        <w:t xml:space="preserve"> (25-28 oct)</w:t>
+          <w:rFonts w:ascii="Arial" w:cs="Arial" w:eastAsia="Arial" w:hAnsi="Arial"/>
+          <w:sz w:val="22"/>
+          <w:szCs w:val="22"/>
+        </w:rPr>
+        <w:t xml:space="preserve">TASK-30: Mapa del cliente con un marcador por parqueadero habilitado y popup para reservar, ajustando la CSP para Leaflet y OpenStreetMap (25-28 oct)</w:t>
       </w:r>
     </w:p>
     <w:p>
@@ -4220,11 +3403,11 @@
       </w:pPr>
       <w:r>
         <w:rPr>
-          <w:rFonts w:ascii="Arial" w:eastAsia="Arial" w:hAnsi="Arial" w:cs="Arial"/>
-          <w:sz w:val="22"/>
-          <w:szCs w:val="22"/>
-        </w:rPr>
-        <w:t>TASK-29: Consulta paginada de los registros de parqueo del cliente en el repositorio y el servicio (1 nov)</w:t>
+          <w:rFonts w:ascii="Arial" w:cs="Arial" w:eastAsia="Arial" w:hAnsi="Arial"/>
+          <w:sz w:val="22"/>
+          <w:szCs w:val="22"/>
+        </w:rPr>
+        <w:t xml:space="preserve">TASK-31: Consulta paginada de los registros de parqueo del cliente en el repositorio y el servicio (30 oct - 1 nov)</w:t>
       </w:r>
     </w:p>
     <w:p>
@@ -4238,11 +3421,11 @@
       </w:pPr>
       <w:r>
         <w:rPr>
-          <w:rFonts w:ascii="Arial" w:eastAsia="Arial" w:hAnsi="Arial" w:cs="Arial"/>
-          <w:sz w:val="22"/>
-          <w:szCs w:val="22"/>
-        </w:rPr>
-        <w:t>TASK-30: Vista cliente/parqueos.html y enlace “Mis parqueos” en la barra del cliente (2-3 nov)</w:t>
+          <w:rFonts w:ascii="Arial" w:cs="Arial" w:eastAsia="Arial" w:hAnsi="Arial"/>
+          <w:sz w:val="22"/>
+          <w:szCs w:val="22"/>
+        </w:rPr>
+        <w:t xml:space="preserve">TASK-32: Vista cliente/parqueos.html y enlace “Mis parqueos” en la barra del cliente (2-3 nov)</w:t>
       </w:r>
     </w:p>
     <w:p>
@@ -4256,19 +3439,11 @@
       </w:pPr>
       <w:r>
         <w:rPr>
-          <w:rFonts w:ascii="Arial" w:eastAsia="Arial" w:hAnsi="Arial" w:cs="Arial"/>
-          <w:sz w:val="22"/>
-          <w:szCs w:val="22"/>
-        </w:rPr>
-        <w:t>TASK-31: Descarga de la factura en PDF validando que e</w:t>
-      </w:r>
-      <w:r>
-        <w:rPr>
-          <w:rFonts w:ascii="Arial" w:eastAsia="Arial" w:hAnsi="Arial" w:cs="Arial"/>
-          <w:sz w:val="22"/>
-          <w:szCs w:val="22"/>
-        </w:rPr>
-        <w:t>l registro sea del propio cliente (4 nov)</w:t>
+          <w:rFonts w:ascii="Arial" w:cs="Arial" w:eastAsia="Arial" w:hAnsi="Arial"/>
+          <w:sz w:val="22"/>
+          <w:szCs w:val="22"/>
+        </w:rPr>
+        <w:t xml:space="preserve">TASK-33: Descarga de la factura en PDF validando que el registro sea del propio cliente (4 nov)</w:t>
       </w:r>
     </w:p>
     <w:p>
@@ -4351,107 +3526,45 @@
       </w:pPr>
       <w:r>
         <w:rPr>
-          <w:rFonts w:ascii="Arial" w:eastAsia="Arial" w:hAnsi="Arial" w:cs="Arial"/>
-          <w:b/>
-          <w:bCs/>
-          <w:sz w:val="22"/>
-          <w:szCs w:val="22"/>
-        </w:rPr>
-        <w:t>AC1:</w:t>
-      </w:r>
-      <w:r>
-        <w:rPr>
-          <w:rFonts w:ascii="Arial" w:eastAsia="Arial" w:hAnsi="Arial" w:cs="Arial"/>
-          <w:sz w:val="22"/>
-          <w:szCs w:val="22"/>
-        </w:rPr>
-        <w:t xml:space="preserve"> Dado el </w:t>
-      </w:r>
-      <w:proofErr w:type="spellStart"/>
-      <w:r>
-        <w:rPr>
-          <w:rFonts w:ascii="Arial" w:eastAsia="Arial" w:hAnsi="Arial" w:cs="Arial"/>
-          <w:sz w:val="22"/>
-          <w:szCs w:val="22"/>
-        </w:rPr>
-        <w:t>login</w:t>
-      </w:r>
-      <w:proofErr w:type="spellEnd"/>
-      <w:r>
-        <w:rPr>
-          <w:rFonts w:ascii="Arial" w:eastAsia="Arial" w:hAnsi="Arial" w:cs="Arial"/>
-          <w:sz w:val="22"/>
-          <w:szCs w:val="22"/>
-        </w:rPr>
-        <w:t xml:space="preserve"> web (cookie JWT), el </w:t>
-      </w:r>
-      <w:proofErr w:type="spellStart"/>
-      <w:r>
-        <w:rPr>
-          <w:rFonts w:ascii="Arial" w:eastAsia="Arial" w:hAnsi="Arial" w:cs="Arial"/>
-          <w:sz w:val="22"/>
-          <w:szCs w:val="22"/>
-        </w:rPr>
-        <w:t>login</w:t>
-      </w:r>
-      <w:proofErr w:type="spellEnd"/>
-      <w:r>
-        <w:rPr>
-          <w:rFonts w:ascii="Arial" w:eastAsia="Arial" w:hAnsi="Arial" w:cs="Arial"/>
-          <w:sz w:val="22"/>
-          <w:szCs w:val="22"/>
-        </w:rPr>
-        <w:t xml:space="preserve"> por la API JWT y el </w:t>
-      </w:r>
-      <w:proofErr w:type="spellStart"/>
-      <w:r>
-        <w:rPr>
-          <w:rFonts w:ascii="Arial" w:eastAsia="Arial" w:hAnsi="Arial" w:cs="Arial"/>
-          <w:sz w:val="22"/>
-          <w:szCs w:val="22"/>
-        </w:rPr>
-        <w:t>login</w:t>
-      </w:r>
-      <w:proofErr w:type="spellEnd"/>
-      <w:r>
-        <w:rPr>
-          <w:rFonts w:ascii="Arial" w:eastAsia="Arial" w:hAnsi="Arial" w:cs="Arial"/>
-          <w:sz w:val="22"/>
-          <w:szCs w:val="22"/>
-        </w:rPr>
-        <w:t xml:space="preserve"> con Google, cuando se prueban usuarios con cada rol, entonces cada uno solo accede a lo que le corresponde.</w:t>
-      </w:r>
-    </w:p>
-    <w:p>
-      <w:pPr>
-        <w:spacing w:after="120"/>
-        <w:ind w:left="720"/>
-      </w:pPr>
-      <w:r>
-        <w:rPr>
-          <w:rFonts w:ascii="Arial" w:eastAsia="Arial" w:hAnsi="Arial" w:cs="Arial"/>
-          <w:b/>
-          <w:bCs/>
-          <w:sz w:val="22"/>
-          <w:szCs w:val="22"/>
-        </w:rPr>
-        <w:t>AC2:</w:t>
-      </w:r>
-      <w:r>
-        <w:rPr>
-          <w:rFonts w:ascii="Arial" w:eastAsia="Arial" w:hAnsi="Arial" w:cs="Arial"/>
-          <w:sz w:val="22"/>
-          <w:szCs w:val="22"/>
-        </w:rPr>
-        <w:t xml:space="preserve"> Dado</w:t>
-      </w:r>
-      <w:r>
-        <w:rPr>
-          <w:rFonts w:ascii="Arial" w:eastAsia="Arial" w:hAnsi="Arial" w:cs="Arial"/>
-          <w:sz w:val="22"/>
-          <w:szCs w:val="22"/>
-        </w:rPr>
-        <w:t xml:space="preserve"> un usuario deshabilitado, cuando intenta entrar por cualquiera de los tres caminos, entonces es rechazado.</w:t>
+          <w:rFonts w:ascii="Arial" w:cs="Arial" w:eastAsia="Arial" w:hAnsi="Arial"/>
+          <w:b/>
+          <w:bCs/>
+          <w:sz w:val="22"/>
+          <w:szCs w:val="22"/>
+        </w:rPr>
+        <w:t xml:space="preserve">AC1:</w:t>
+      </w:r>
+      <w:r>
+        <w:rPr>
+          <w:rFonts w:ascii="Arial" w:cs="Arial" w:eastAsia="Arial" w:hAnsi="Arial"/>
+          <w:sz w:val="22"/>
+          <w:szCs w:val="22"/>
+        </w:rPr>
+        <w:t xml:space="preserve"> Dado el login web (cookie JWT) y el login con Google, cuando se prueban usuarios con cada rol, entonces cada uno solo accede a lo que le corresponde.</w:t>
+      </w:r>
+    </w:p>
+    <w:p>
+      <w:pPr>
+        <w:spacing w:after="120"/>
+        <w:ind w:left="720"/>
+      </w:pPr>
+      <w:r>
+        <w:rPr>
+          <w:rFonts w:ascii="Arial" w:cs="Arial" w:eastAsia="Arial" w:hAnsi="Arial"/>
+          <w:b/>
+          <w:bCs/>
+          <w:sz w:val="22"/>
+          <w:szCs w:val="22"/>
+        </w:rPr>
+        <w:t xml:space="preserve">AC2:</w:t>
+      </w:r>
+      <w:r>
+        <w:rPr>
+          <w:rFonts w:ascii="Arial" w:cs="Arial" w:eastAsia="Arial" w:hAnsi="Arial"/>
+          <w:sz w:val="22"/>
+          <w:szCs w:val="22"/>
+        </w:rPr>
+        <w:t xml:space="preserve"> Dado un usuario deshabilitado, cuando intenta entrar por cualquiera de los dos caminos, entonces es rechazado.</w:t>
       </w:r>
     </w:p>
     <w:p>
@@ -4524,11 +3637,11 @@
       </w:pPr>
       <w:r>
         <w:rPr>
-          <w:rFonts w:ascii="Arial" w:eastAsia="Arial" w:hAnsi="Arial" w:cs="Arial"/>
-          <w:sz w:val="22"/>
-          <w:szCs w:val="22"/>
-        </w:rPr>
-        <w:t>TASK-32: Pruebas de integración de autenticación, roles y usuarios deshabilitados (5-6 nov)</w:t>
+          <w:rFonts w:ascii="Arial" w:cs="Arial" w:eastAsia="Arial" w:hAnsi="Arial"/>
+          <w:sz w:val="22"/>
+          <w:szCs w:val="22"/>
+        </w:rPr>
+        <w:t xml:space="preserve">TASK-34: Pruebas de integración de autenticación, roles y usuarios deshabilitados (5-6 nov)</w:t>
       </w:r>
     </w:p>
     <w:p>
@@ -4542,11 +3655,11 @@
       </w:pPr>
       <w:r>
         <w:rPr>
-          <w:rFonts w:ascii="Arial" w:eastAsia="Arial" w:hAnsi="Arial" w:cs="Arial"/>
-          <w:sz w:val="22"/>
-          <w:szCs w:val="22"/>
-        </w:rPr>
-        <w:t>TASK-33: Pruebas manuales de regresión del flujo principal en navegadores y móvil (7-8 nov)</w:t>
+          <w:rFonts w:ascii="Arial" w:cs="Arial" w:eastAsia="Arial" w:hAnsi="Arial"/>
+          <w:sz w:val="22"/>
+          <w:szCs w:val="22"/>
+        </w:rPr>
+        <w:t xml:space="preserve">TASK-35: Pruebas manuales de regresión del flujo principal en navegadores y móvil (7-8 nov)</w:t>
       </w:r>
     </w:p>
     <w:p>
@@ -4657,21 +3770,21 @@
       </w:pPr>
       <w:r>
         <w:rPr>
-          <w:rFonts w:ascii="Arial" w:eastAsia="Arial" w:hAnsi="Arial" w:cs="Arial"/>
-          <w:b/>
-          <w:bCs/>
-          <w:sz w:val="22"/>
-          <w:szCs w:val="22"/>
-        </w:rPr>
-        <w:t>AC2:</w:t>
-      </w:r>
-      <w:r>
-        <w:rPr>
-          <w:rFonts w:ascii="Arial" w:eastAsia="Arial" w:hAnsi="Arial" w:cs="Arial"/>
-          <w:sz w:val="22"/>
-          <w:szCs w:val="22"/>
-        </w:rPr>
-        <w:t xml:space="preserve"> Las claves y credenciales (JWT, Google, base de datos, certificado local) no deben estar escritas en el código; el certificado solo se usa en el perfil de desarrollo.</w:t>
+          <w:rFonts w:ascii="Arial" w:cs="Arial" w:eastAsia="Arial" w:hAnsi="Arial"/>
+          <w:b/>
+          <w:bCs/>
+          <w:sz w:val="22"/>
+          <w:szCs w:val="22"/>
+        </w:rPr>
+        <w:t xml:space="preserve">AC2:</w:t>
+      </w:r>
+      <w:r>
+        <w:rPr>
+          <w:rFonts w:ascii="Arial" w:cs="Arial" w:eastAsia="Arial" w:hAnsi="Arial"/>
+          <w:sz w:val="22"/>
+          <w:szCs w:val="22"/>
+        </w:rPr>
+        <w:t xml:space="preserve"> Las claves y credenciales (JWT, Google, base de datos, correo) no deben estar escritas en el código, y el repositorio no debe incluir certificados ni llaves privadas.</w:t>
       </w:r>
     </w:p>
     <w:p>
@@ -4767,29 +3880,21 @@
       </w:pPr>
       <w:r>
         <w:rPr>
-          <w:rFonts w:ascii="Arial" w:eastAsia="Arial" w:hAnsi="Arial" w:cs="Arial"/>
-          <w:b/>
-          <w:bCs/>
-          <w:sz w:val="22"/>
-          <w:szCs w:val="22"/>
-        </w:rPr>
-        <w:t>AC4:</w:t>
-      </w:r>
-      <w:r>
-        <w:rPr>
-          <w:rFonts w:ascii="Arial" w:eastAsia="Arial" w:hAnsi="Arial" w:cs="Arial"/>
-          <w:sz w:val="22"/>
-          <w:szCs w:val="22"/>
-        </w:rPr>
-        <w:t xml:space="preserve"> El documento de historias de usuario debe incluir las nuevas funcionalidades (JWT, Google, recuperación de c</w:t>
-      </w:r>
-      <w:r>
-        <w:rPr>
-          <w:rFonts w:ascii="Arial" w:eastAsia="Arial" w:hAnsi="Arial" w:cs="Arial"/>
-          <w:sz w:val="22"/>
-          <w:szCs w:val="22"/>
-        </w:rPr>
-        <w:t>ontraseña, cancelación de reservas y Mis parqueos).</w:t>
+          <w:rFonts w:ascii="Arial" w:cs="Arial" w:eastAsia="Arial" w:hAnsi="Arial"/>
+          <w:b/>
+          <w:bCs/>
+          <w:sz w:val="22"/>
+          <w:szCs w:val="22"/>
+        </w:rPr>
+        <w:t xml:space="preserve">AC4:</w:t>
+      </w:r>
+      <w:r>
+        <w:rPr>
+          <w:rFonts w:ascii="Arial" w:cs="Arial" w:eastAsia="Arial" w:hAnsi="Arial"/>
+          <w:sz w:val="22"/>
+          <w:szCs w:val="22"/>
+        </w:rPr>
+        <w:t xml:space="preserve"> El documento de historias de usuario debe incluir las nuevas funcionalidades (JWT, Google, recuperación de contraseña, cancelación de reservas, edición del perfil, mapa de parqueaderos y Mis parqueos).</w:t>
       </w:r>
     </w:p>
     <w:p>
@@ -4820,11 +3925,11 @@
       </w:pPr>
       <w:r>
         <w:rPr>
-          <w:rFonts w:ascii="Arial" w:eastAsia="Arial" w:hAnsi="Arial" w:cs="Arial"/>
-          <w:sz w:val="22"/>
-          <w:szCs w:val="22"/>
-        </w:rPr>
-        <w:t>TASK-34: Mover la contraseña del certificado local y demás credenciales a variables de entorno o al perfil de desarrollo (9 nov)</w:t>
+          <w:rFonts w:ascii="Arial" w:cs="Arial" w:eastAsia="Arial" w:hAnsi="Arial"/>
+          <w:sz w:val="22"/>
+          <w:szCs w:val="22"/>
+        </w:rPr>
+        <w:t xml:space="preserve">TASK-36: Retirar del repositorio el certificado de desarrollo y su contraseña, con todas las credenciales en variables de entorno; el HTTPS lo pone Render (9 nov)</w:t>
       </w:r>
     </w:p>
     <w:p>
@@ -4838,19 +3943,11 @@
       </w:pPr>
       <w:r>
         <w:rPr>
-          <w:rFonts w:ascii="Arial" w:eastAsia="Arial" w:hAnsi="Arial" w:cs="Arial"/>
-          <w:sz w:val="22"/>
-          <w:szCs w:val="22"/>
-        </w:rPr>
-        <w:t>TASK-35: Despliegue final en Render y verificación de los flujos en</w:t>
-      </w:r>
-      <w:r>
-        <w:rPr>
-          <w:rFonts w:ascii="Arial" w:eastAsia="Arial" w:hAnsi="Arial" w:cs="Arial"/>
-          <w:sz w:val="22"/>
-          <w:szCs w:val="22"/>
-        </w:rPr>
-        <w:t xml:space="preserve"> producción (10 nov)</w:t>
+          <w:rFonts w:ascii="Arial" w:cs="Arial" w:eastAsia="Arial" w:hAnsi="Arial"/>
+          <w:sz w:val="22"/>
+          <w:szCs w:val="22"/>
+        </w:rPr>
+        <w:t xml:space="preserve">TASK-37: Despliegue final en Render y verificación de los flujos en producción (10 nov)</w:t>
       </w:r>
     </w:p>
     <w:p>
@@ -4864,47 +3961,11 @@
       </w:pPr>
       <w:r>
         <w:rPr>
-          <w:rFonts w:ascii="Arial" w:eastAsia="Arial" w:hAnsi="Arial" w:cs="Arial"/>
-          <w:sz w:val="22"/>
-          <w:szCs w:val="22"/>
-        </w:rPr>
-        <w:t xml:space="preserve">TASK-36: Retirar o actualizar la configuración de </w:t>
-      </w:r>
-      <w:proofErr w:type="spellStart"/>
-      <w:r>
-        <w:rPr>
-          <w:rFonts w:ascii="Arial" w:eastAsia="Arial" w:hAnsi="Arial" w:cs="Arial"/>
-          <w:sz w:val="22"/>
-          <w:szCs w:val="22"/>
-        </w:rPr>
-        <w:t>Railway</w:t>
-      </w:r>
-      <w:proofErr w:type="spellEnd"/>
-      <w:r>
-        <w:rPr>
-          <w:rFonts w:ascii="Arial" w:eastAsia="Arial" w:hAnsi="Arial" w:cs="Arial"/>
-          <w:sz w:val="22"/>
-          <w:szCs w:val="22"/>
-        </w:rPr>
-        <w:t xml:space="preserve"> y </w:t>
-      </w:r>
-      <w:proofErr w:type="spellStart"/>
-      <w:r>
-        <w:rPr>
-          <w:rFonts w:ascii="Arial" w:eastAsia="Arial" w:hAnsi="Arial" w:cs="Arial"/>
-          <w:sz w:val="22"/>
-          <w:szCs w:val="22"/>
-        </w:rPr>
-        <w:t>nginx</w:t>
-      </w:r>
-      <w:proofErr w:type="spellEnd"/>
-      <w:r>
-        <w:rPr>
-          <w:rFonts w:ascii="Arial" w:eastAsia="Arial" w:hAnsi="Arial" w:cs="Arial"/>
-          <w:sz w:val="22"/>
-          <w:szCs w:val="22"/>
-        </w:rPr>
-        <w:t>, y actualizar historias de usuario y documentación de uso (11 nov)</w:t>
+          <w:rFonts w:ascii="Arial" w:cs="Arial" w:eastAsia="Arial" w:hAnsi="Arial"/>
+          <w:sz w:val="22"/>
+          <w:szCs w:val="22"/>
+        </w:rPr>
+        <w:t xml:space="preserve">TASK-38: Retirar o actualizar la configuración de Railway y nginx, y actualizar historias de usuario y documentación de uso (11 nov)</w:t>
       </w:r>
     </w:p>
     <w:p>

</xml_diff>